<commit_message>
~ minimal template (without specific info since it's a public rep)
</commit_message>
<xml_diff>
--- a/data/db/hsv1/template.docx
+++ b/data/db/hsv1/template.docx
@@ -1,12 +1,13 @@
 
 <file path=word/document.xml><?xml version="1.0" encoding="utf-8"?>
-<w:document xmlns:wpc="http://schemas.microsoft.com/office/word/2010/wordprocessingCanvas" xmlns:cx="http://schemas.microsoft.com/office/drawing/2014/chartex" xmlns:cx1="http://schemas.microsoft.com/office/drawing/2015/9/8/chartex" xmlns:cx2="http://schemas.microsoft.com/office/drawing/2015/10/21/chartex" xmlns:cx3="http://schemas.microsoft.com/office/drawing/2016/5/9/chartex" xmlns:cx4="http://schemas.microsoft.com/office/drawing/2016/5/10/chartex" xmlns:cx5="http://schemas.microsoft.com/office/drawing/2016/5/11/chartex" xmlns:cx6="http://schemas.microsoft.com/office/drawing/2016/5/12/chartex" xmlns:cx7="http://schemas.microsoft.com/office/drawing/2016/5/13/chartex" xmlns:cx8="http://schemas.microsoft.com/office/drawing/2016/5/14/chartex" xmlns:mc="http://schemas.openxmlformats.org/markup-compatibility/2006" xmlns:aink="http://schemas.microsoft.com/office/drawing/2016/ink" xmlns:am3d="http://schemas.microsoft.com/office/drawing/2017/model3d" xmlns:o="urn:schemas-microsoft-com:office:office" xmlns:oel="http://schemas.microsoft.com/office/2019/extlst" xmlns:r="http://schemas.openxmlformats.org/officeDocument/2006/relationships" xmlns:m="http://schemas.openxmlformats.org/officeDocument/2006/math" xmlns:v="urn:schemas-microsoft-com:vml" xmlns:wp14="http://schemas.microsoft.com/office/word/2010/wordprocessingDrawing" xmlns:wp="http://schemas.openxmlformats.org/drawingml/2006/wordprocessingDrawing" xmlns:w10="urn:schemas-microsoft-com:office:word" xmlns:w="http://schemas.openxmlformats.org/wordprocessingml/2006/main" xmlns:w14="http://schemas.microsoft.com/office/word/2010/wordml" xmlns:w15="http://schemas.microsoft.com/office/word/2012/wordml" xmlns:w16cex="http://schemas.microsoft.com/office/word/2018/wordml/cex" xmlns:w16cid="http://schemas.microsoft.com/office/word/2016/wordml/cid" xmlns:w16="http://schemas.microsoft.com/office/word/2018/wordml" xmlns:w16du="http://schemas.microsoft.com/office/word/2023/wordml/word16du" xmlns:w16sdtdh="http://schemas.microsoft.com/office/word/2020/wordml/sdtdatahash" xmlns:w16se="http://schemas.microsoft.com/office/word/2015/wordml/symex" xmlns:wpg="http://schemas.microsoft.com/office/word/2010/wordprocessingGroup" xmlns:wpi="http://schemas.microsoft.com/office/word/2010/wordprocessingInk" xmlns:wne="http://schemas.microsoft.com/office/word/2006/wordml" xmlns:wps="http://schemas.microsoft.com/office/word/2010/wordprocessingShape" mc:Ignorable="w14 w15 w16se w16cid w16 w16cex w16sdtdh w16du wp14">
+<w:document xmlns:o="urn:schemas-microsoft-com:office:office" xmlns:r="http://schemas.openxmlformats.org/officeDocument/2006/relationships" xmlns:v="urn:schemas-microsoft-com:vml" xmlns:w="http://schemas.openxmlformats.org/wordprocessingml/2006/main" xmlns:w10="urn:schemas-microsoft-com:office:word" xmlns:wp="http://schemas.openxmlformats.org/drawingml/2006/wordprocessingDrawing" xmlns:wps="http://schemas.microsoft.com/office/word/2010/wordprocessingShape" xmlns:wpg="http://schemas.microsoft.com/office/word/2010/wordprocessingGroup" xmlns:mc="http://schemas.openxmlformats.org/markup-compatibility/2006" xmlns:wp14="http://schemas.microsoft.com/office/word/2010/wordprocessingDrawing" xmlns:w14="http://schemas.microsoft.com/office/word/2010/wordml" xmlns:w15="http://schemas.microsoft.com/office/word/2012/wordml" mc:Ignorable="w14 wp14 w15">
   <w:body>
     <w:p>
       <w:pPr>
         <w:pStyle w:val="Titre1"/>
-        <w:rPr>
-          <w:color w:val="215E99" w:themeColor="text2" w:themeTint="BF"/>
+        <w:spacing w:before="360" w:after="80"/>
+        <w:rPr>
+          <w:color w:val="215E99" w:themeColor="text2" w:themeTint="bf"/>
           <w:sz w:val="32"/>
           <w:szCs w:val="32"/>
           <w:lang w:val="fr-CH"/>
@@ -14,118 +15,95 @@
       </w:pPr>
       <w:r>
         <w:rPr>
-          <w:color w:val="215E99" w:themeColor="text2" w:themeTint="BF"/>
+          <w:color w:val="215E99" w:themeColor="text2" w:themeTint="bf"/>
           <w:sz w:val="32"/>
           <w:szCs w:val="32"/>
           <w:lang w:val="fr-CH"/>
         </w:rPr>
         <w:t xml:space="preserve">Interprétation de mutations génotypiques pour </w:t>
-      </w:r>
-      <w:r>
-        <w:rPr>
-          <w:color w:val="215E99" w:themeColor="text2" w:themeTint="BF"/>
-          <w:sz w:val="32"/>
-          <w:szCs w:val="32"/>
-          <w:lang w:val="fr-CH"/>
-        </w:rPr>
         <w:br/>
-      </w:r>
-      <w:r>
-        <w:rPr>
-          <w:color w:val="215E99" w:themeColor="text2" w:themeTint="BF"/>
-          <w:sz w:val="32"/>
-          <w:szCs w:val="32"/>
-          <w:lang w:val="fr-CH"/>
-        </w:rPr>
         <w:t>la résistance aux antiviraux (HSV-1)</w:t>
       </w:r>
     </w:p>
     <w:tbl>
       <w:tblPr>
         <w:tblStyle w:val="Grilledutableau"/>
-        <w:tblpPr w:leftFromText="141" w:rightFromText="141" w:vertAnchor="text" w:horzAnchor="margin" w:tblpY="190"/>
+        <w:tblpPr w:bottomFromText="0" w:horzAnchor="margin" w:leftFromText="141" w:rightFromText="141" w:tblpX="0" w:tblpY="190" w:topFromText="0" w:vertAnchor="text"/>
         <w:tblW w:w="8931" w:type="dxa"/>
-        <w:tblBorders>
-          <w:left w:val="none" w:sz="0" w:space="0" w:color="auto"/>
-          <w:right w:val="none" w:sz="0" w:space="0" w:color="auto"/>
-          <w:insideH w:val="none" w:sz="0" w:space="0" w:color="auto"/>
-          <w:insideV w:val="none" w:sz="0" w:space="0" w:color="auto"/>
-        </w:tblBorders>
-        <w:tblLook w:val="04A0" w:firstRow="1" w:lastRow="0" w:firstColumn="1" w:lastColumn="0" w:noHBand="0" w:noVBand="1"/>
+        <w:jc w:val="left"/>
+        <w:tblInd w:w="0" w:type="dxa"/>
+        <w:tblLayout w:type="fixed"/>
+        <w:tblCellMar>
+          <w:top w:w="0" w:type="dxa"/>
+          <w:left w:w="108" w:type="dxa"/>
+          <w:bottom w:w="0" w:type="dxa"/>
+          <w:right w:w="108" w:type="dxa"/>
+        </w:tblCellMar>
+        <w:tblLook w:val="04a0" w:noHBand="0" w:noVBand="1" w:firstColumn="1" w:lastRow="0" w:lastColumn="0" w:firstRow="1"/>
       </w:tblPr>
       <w:tblGrid>
-        <w:gridCol w:w="2268"/>
+        <w:gridCol w:w="2267"/>
         <w:gridCol w:w="1985"/>
-        <w:gridCol w:w="1843"/>
-        <w:gridCol w:w="2835"/>
+        <w:gridCol w:w="1844"/>
+        <w:gridCol w:w="2834"/>
       </w:tblGrid>
       <w:tr>
         <w:trPr>
-          <w:trHeight w:val="274"/>
+          <w:trHeight w:val="274" w:hRule="atLeast"/>
         </w:trPr>
         <w:tc>
           <w:tcPr>
-            <w:tcW w:w="2268" w:type="dxa"/>
+            <w:tcW w:w="2267" w:type="dxa"/>
+            <w:tcBorders>
+              <w:left w:val="nil"/>
+              <w:bottom w:val="nil"/>
+              <w:right w:val="nil"/>
+            </w:tcBorders>
           </w:tcPr>
           <w:p>
             <w:pPr>
+              <w:pStyle w:val="Normal"/>
+              <w:widowControl w:val="false"/>
+              <w:suppressAutoHyphens w:val="true"/>
+              <w:spacing w:lineRule="auto" w:line="240" w:before="0" w:after="0"/>
+              <w:jc w:val="left"/>
               <w:rPr>
-                <w:rStyle w:val="lev"/>
+                <w:rStyle w:val="Strong"/>
                 <w:sz w:val="22"/>
                 <w:szCs w:val="22"/>
               </w:rPr>
             </w:pPr>
             <w:r>
               <w:rPr>
-                <w:rStyle w:val="lev"/>
+                <w:rStyle w:val="Strong"/>
+                <w:rFonts w:eastAsia="Aptos"/>
+                <w:kern w:val="2"/>
                 <w:sz w:val="22"/>
                 <w:szCs w:val="22"/>
+                <w:lang w:eastAsia="en-US" w:bidi="ar-SA"/>
               </w:rPr>
-              <w:t>D</w:t>
-            </w:r>
-            <w:r>
-              <w:rPr>
-                <w:rStyle w:val="lev"/>
-                <w:sz w:val="22"/>
-                <w:szCs w:val="22"/>
-              </w:rPr>
-              <w:t>ate</w:t>
-            </w:r>
-            <w:r>
-              <w:rPr>
-                <w:rStyle w:val="lev"/>
-                <w:sz w:val="22"/>
-                <w:szCs w:val="22"/>
-              </w:rPr>
-              <w:t xml:space="preserve"> du </w:t>
-            </w:r>
-            <w:proofErr w:type="spellStart"/>
-            <w:r>
-              <w:rPr>
-                <w:rStyle w:val="lev"/>
-                <w:sz w:val="22"/>
-                <w:szCs w:val="22"/>
-              </w:rPr>
-              <w:t>séquençage</w:t>
-            </w:r>
-            <w:proofErr w:type="spellEnd"/>
-            <w:r>
-              <w:rPr>
-                <w:rStyle w:val="lev"/>
-                <w:sz w:val="22"/>
-                <w:szCs w:val="22"/>
-              </w:rPr>
-              <w:t>:</w:t>
+              <w:t>Date du séquençage:</w:t>
             </w:r>
           </w:p>
         </w:tc>
         <w:tc>
           <w:tcPr>
             <w:tcW w:w="1985" w:type="dxa"/>
+            <w:tcBorders>
+              <w:left w:val="nil"/>
+              <w:bottom w:val="nil"/>
+              <w:right w:val="nil"/>
+            </w:tcBorders>
           </w:tcPr>
           <w:p>
             <w:pPr>
+              <w:pStyle w:val="Normal"/>
+              <w:widowControl w:val="false"/>
+              <w:suppressAutoHyphens w:val="true"/>
+              <w:spacing w:lineRule="auto" w:line="240" w:before="0" w:after="0"/>
+              <w:jc w:val="left"/>
               <w:rPr>
+                <w:b/>
                 <w:b/>
                 <w:bCs/>
                 <w:sz w:val="22"/>
@@ -134,8 +112,11 @@
             </w:pPr>
             <w:r>
               <w:rPr>
+                <w:rFonts w:eastAsia="Aptos"/>
+                <w:kern w:val="2"/>
                 <w:sz w:val="22"/>
                 <w:szCs w:val="22"/>
+                <w:lang w:eastAsia="en-US" w:bidi="ar-SA"/>
               </w:rPr>
               <w:t>SEQDATE</w:t>
             </w:r>
@@ -143,59 +124,57 @@
         </w:tc>
         <w:tc>
           <w:tcPr>
-            <w:tcW w:w="1843" w:type="dxa"/>
+            <w:tcW w:w="1844" w:type="dxa"/>
+            <w:tcBorders>
+              <w:left w:val="nil"/>
+              <w:bottom w:val="nil"/>
+              <w:right w:val="nil"/>
+            </w:tcBorders>
           </w:tcPr>
           <w:p>
             <w:pPr>
+              <w:pStyle w:val="Normal"/>
+              <w:widowControl w:val="false"/>
+              <w:suppressAutoHyphens w:val="true"/>
+              <w:spacing w:lineRule="auto" w:line="240" w:before="0" w:after="0"/>
+              <w:jc w:val="left"/>
               <w:rPr>
-                <w:rStyle w:val="lev"/>
+                <w:rStyle w:val="Strong"/>
                 <w:sz w:val="22"/>
                 <w:szCs w:val="22"/>
               </w:rPr>
             </w:pPr>
-            <w:proofErr w:type="spellStart"/>
             <w:r>
               <w:rPr>
-                <w:rStyle w:val="lev"/>
+                <w:rStyle w:val="Strong"/>
+                <w:rFonts w:eastAsia="Aptos"/>
+                <w:kern w:val="2"/>
                 <w:sz w:val="22"/>
                 <w:szCs w:val="22"/>
+                <w:lang w:eastAsia="en-US" w:bidi="ar-SA"/>
               </w:rPr>
-              <w:t>Numéro</w:t>
-            </w:r>
-            <w:proofErr w:type="spellEnd"/>
-            <w:r>
-              <w:rPr>
-                <w:rStyle w:val="lev"/>
-                <w:sz w:val="22"/>
-                <w:szCs w:val="22"/>
-              </w:rPr>
-              <w:t xml:space="preserve"> </w:t>
-            </w:r>
-            <w:r>
-              <w:rPr>
-                <w:rStyle w:val="lev"/>
-                <w:sz w:val="22"/>
-                <w:szCs w:val="22"/>
-              </w:rPr>
-              <w:t>de tube</w:t>
-            </w:r>
-            <w:r>
-              <w:rPr>
-                <w:rStyle w:val="lev"/>
-                <w:sz w:val="22"/>
-                <w:szCs w:val="22"/>
-              </w:rPr>
-              <w:t>:</w:t>
+              <w:t>Numéro de tube:</w:t>
             </w:r>
           </w:p>
         </w:tc>
         <w:tc>
           <w:tcPr>
-            <w:tcW w:w="2835" w:type="dxa"/>
+            <w:tcW w:w="2834" w:type="dxa"/>
+            <w:tcBorders>
+              <w:left w:val="nil"/>
+              <w:bottom w:val="nil"/>
+              <w:right w:val="nil"/>
+            </w:tcBorders>
           </w:tcPr>
           <w:p>
             <w:pPr>
+              <w:pStyle w:val="Normal"/>
+              <w:widowControl w:val="false"/>
+              <w:suppressAutoHyphens w:val="true"/>
+              <w:spacing w:lineRule="auto" w:line="240" w:before="0" w:after="0"/>
+              <w:jc w:val="left"/>
               <w:rPr>
+                <w:b/>
                 <w:b/>
                 <w:bCs/>
                 <w:sz w:val="22"/>
@@ -204,8 +183,11 @@
             </w:pPr>
             <w:r>
               <w:rPr>
+                <w:rFonts w:eastAsia="Aptos"/>
+                <w:kern w:val="2"/>
                 <w:sz w:val="22"/>
                 <w:szCs w:val="22"/>
+                <w:lang w:eastAsia="en-US" w:bidi="ar-SA"/>
               </w:rPr>
               <w:t>IDTUBE</w:t>
             </w:r>
@@ -213,23 +195,37 @@
         </w:tc>
       </w:tr>
       <w:tr>
+        <w:trPr/>
         <w:tc>
           <w:tcPr>
-            <w:tcW w:w="2268" w:type="dxa"/>
+            <w:tcW w:w="2267" w:type="dxa"/>
+            <w:tcBorders>
+              <w:top w:val="nil"/>
+              <w:left w:val="nil"/>
+              <w:right w:val="nil"/>
+            </w:tcBorders>
           </w:tcPr>
           <w:p>
             <w:pPr>
+              <w:pStyle w:val="Normal"/>
+              <w:widowControl w:val="false"/>
+              <w:suppressAutoHyphens w:val="true"/>
+              <w:spacing w:lineRule="auto" w:line="240" w:before="0" w:after="0"/>
+              <w:jc w:val="left"/>
               <w:rPr>
-                <w:rStyle w:val="lev"/>
+                <w:rStyle w:val="Strong"/>
                 <w:sz w:val="22"/>
                 <w:szCs w:val="22"/>
               </w:rPr>
             </w:pPr>
             <w:r>
               <w:rPr>
-                <w:rStyle w:val="lev"/>
+                <w:rStyle w:val="Strong"/>
+                <w:rFonts w:eastAsia="Aptos"/>
+                <w:kern w:val="2"/>
                 <w:sz w:val="22"/>
                 <w:szCs w:val="22"/>
+                <w:lang w:eastAsia="en-US" w:bidi="ar-SA"/>
               </w:rPr>
               <w:t>Initials du patient:</w:t>
             </w:r>
@@ -238,9 +234,19 @@
         <w:tc>
           <w:tcPr>
             <w:tcW w:w="1985" w:type="dxa"/>
+            <w:tcBorders>
+              <w:top w:val="nil"/>
+              <w:left w:val="nil"/>
+              <w:right w:val="nil"/>
+            </w:tcBorders>
           </w:tcPr>
           <w:p>
             <w:pPr>
+              <w:pStyle w:val="Normal"/>
+              <w:widowControl w:val="false"/>
+              <w:suppressAutoHyphens w:val="true"/>
+              <w:spacing w:lineRule="auto" w:line="240" w:before="0" w:after="0"/>
+              <w:jc w:val="left"/>
               <w:rPr>
                 <w:sz w:val="22"/>
                 <w:szCs w:val="22"/>
@@ -248,8 +254,11 @@
             </w:pPr>
             <w:r>
               <w:rPr>
+                <w:rFonts w:eastAsia="Aptos"/>
+                <w:kern w:val="2"/>
                 <w:sz w:val="22"/>
                 <w:szCs w:val="22"/>
+                <w:lang w:eastAsia="en-US" w:bidi="ar-SA"/>
               </w:rPr>
               <w:t>IDPATIENT</w:t>
             </w:r>
@@ -257,21 +266,34 @@
         </w:tc>
         <w:tc>
           <w:tcPr>
-            <w:tcW w:w="1843" w:type="dxa"/>
+            <w:tcW w:w="1844" w:type="dxa"/>
+            <w:tcBorders>
+              <w:top w:val="nil"/>
+              <w:left w:val="nil"/>
+              <w:right w:val="nil"/>
+            </w:tcBorders>
           </w:tcPr>
           <w:p>
             <w:pPr>
+              <w:pStyle w:val="Normal"/>
+              <w:widowControl w:val="false"/>
+              <w:suppressAutoHyphens w:val="true"/>
+              <w:spacing w:lineRule="auto" w:line="240" w:before="0" w:after="0"/>
+              <w:jc w:val="left"/>
               <w:rPr>
-                <w:rStyle w:val="lev"/>
+                <w:rStyle w:val="Strong"/>
                 <w:sz w:val="22"/>
                 <w:szCs w:val="22"/>
               </w:rPr>
             </w:pPr>
             <w:r>
               <w:rPr>
-                <w:rStyle w:val="lev"/>
+                <w:rStyle w:val="Strong"/>
+                <w:rFonts w:eastAsia="Aptos"/>
+                <w:kern w:val="2"/>
                 <w:sz w:val="22"/>
                 <w:szCs w:val="22"/>
+                <w:lang w:eastAsia="en-US" w:bidi="ar-SA"/>
               </w:rPr>
               <w:t>Matériel:</w:t>
             </w:r>
@@ -279,111 +301,52 @@
         </w:tc>
         <w:tc>
           <w:tcPr>
-            <w:tcW w:w="2835" w:type="dxa"/>
+            <w:tcW w:w="2834" w:type="dxa"/>
+            <w:tcBorders>
+              <w:top w:val="nil"/>
+              <w:left w:val="nil"/>
+              <w:right w:val="nil"/>
+            </w:tcBorders>
           </w:tcPr>
           <w:p>
             <w:pPr>
+              <w:pStyle w:val="Normal"/>
+              <w:widowControl w:val="false"/>
+              <w:suppressAutoHyphens w:val="true"/>
+              <w:spacing w:lineRule="auto" w:line="240" w:before="0" w:after="0"/>
+              <w:jc w:val="left"/>
               <w:rPr>
                 <w:sz w:val="22"/>
                 <w:szCs w:val="22"/>
               </w:rPr>
             </w:pPr>
             <w:r>
-              <w:rPr>
-                <w:sz w:val="22"/>
-                <w:szCs w:val="22"/>
-              </w:rPr>
-              <w:t>Serum</w:t>
+              <w:rPr/>
             </w:r>
           </w:p>
         </w:tc>
       </w:tr>
     </w:tbl>
-    <w:p/>
     <w:p>
       <w:pPr>
-        <w:rPr>
-          <w:lang w:val="fr-CH"/>
-        </w:rPr>
+        <w:pStyle w:val="Normal"/>
+        <w:rPr/>
       </w:pPr>
+      <w:r>
+        <w:rPr/>
+      </w:r>
     </w:p>
     <w:p>
       <w:pPr>
-        <w:pStyle w:val="Titre2"/>
+        <w:pStyle w:val="Normal"/>
         <w:rPr>
           <w:lang w:val="fr-CH"/>
         </w:rPr>
       </w:pPr>
       <w:r>
         <w:rPr>
-          <w:color w:val="215E99" w:themeColor="text2" w:themeTint="BF"/>
-          <w:sz w:val="28"/>
-          <w:szCs w:val="28"/>
           <w:lang w:val="fr-CH"/>
         </w:rPr>
-        <w:t xml:space="preserve">Résultat </w:t>
-      </w:r>
-      <w:r>
-        <w:rPr>
-          <w:color w:val="215E99" w:themeColor="text2" w:themeTint="BF"/>
-          <w:sz w:val="28"/>
-          <w:szCs w:val="28"/>
-          <w:lang w:val="fr-CH"/>
-        </w:rPr>
-        <w:t xml:space="preserve">du </w:t>
-      </w:r>
-      <w:r>
-        <w:rPr>
-          <w:color w:val="215E99" w:themeColor="text2" w:themeTint="BF"/>
-          <w:sz w:val="28"/>
-          <w:szCs w:val="28"/>
-          <w:lang w:val="fr-CH"/>
-        </w:rPr>
-        <w:t xml:space="preserve">séquençage </w:t>
-      </w:r>
-      <w:r>
-        <w:rPr>
-          <w:color w:val="215E99" w:themeColor="text2" w:themeTint="BF"/>
-          <w:sz w:val="28"/>
-          <w:szCs w:val="28"/>
-          <w:lang w:val="fr-CH"/>
-        </w:rPr>
-        <w:t>du g</w:t>
-      </w:r>
-      <w:r>
-        <w:rPr>
-          <w:color w:val="215E99" w:themeColor="text2" w:themeTint="BF"/>
-          <w:sz w:val="28"/>
-          <w:szCs w:val="28"/>
-          <w:lang w:val="fr-CH"/>
-        </w:rPr>
-        <w:t>ène UL23</w:t>
-      </w:r>
-      <w:bookmarkStart w:id="0" w:name="_Ref170228463"/>
-      <w:bookmarkStart w:id="1" w:name="_Ref170228208"/>
-      <w:r>
-        <w:rPr>
-          <w:rStyle w:val="Appelnotedebasdep"/>
-          <w:color w:val="215E99" w:themeColor="text2" w:themeTint="BF"/>
-          <w:sz w:val="28"/>
-          <w:szCs w:val="28"/>
-          <w:lang w:val="fr-CH"/>
-        </w:rPr>
-        <w:footnoteReference w:id="1"/>
-      </w:r>
-      <w:bookmarkEnd w:id="0"/>
-      <w:bookmarkEnd w:id="1"/>
-      <w:r>
-        <w:rPr>
-          <w:lang w:val="fr-CH"/>
-        </w:rPr>
-        <w:t xml:space="preserve"> </w:t>
-      </w:r>
-      <w:r>
-        <w:rPr>
-          <w:lang w:val="fr-CH"/>
-        </w:rPr>
-        <w:t>RES-UL23-HHV1</w:t>
       </w:r>
     </w:p>
     <w:p>
@@ -393,6 +356,35 @@
           <w:lang w:val="fr-CH"/>
         </w:rPr>
       </w:pPr>
+      <w:r>
+        <w:rPr>
+          <w:color w:val="215E99" w:themeColor="text2" w:themeTint="bf"/>
+          <w:sz w:val="28"/>
+          <w:szCs w:val="28"/>
+          <w:lang w:val="fr-CH"/>
+        </w:rPr>
+        <w:t>Résultat du séquençage du gène UL23</w:t>
+      </w:r>
+      <w:bookmarkStart w:id="0" w:name="_Ref170228463"/>
+      <w:bookmarkStart w:id="1" w:name="_Ref170228208"/>
+      <w:bookmarkEnd w:id="0"/>
+      <w:bookmarkEnd w:id="1"/>
+      <w:r>
+        <w:rPr>
+          <w:rStyle w:val="Ancredenotedebasdepage"/>
+          <w:color w:val="215E99" w:themeColor="text2" w:themeTint="bf"/>
+          <w:sz w:val="28"/>
+          <w:szCs w:val="28"/>
+          <w:lang w:val="fr-CH"/>
+        </w:rPr>
+        <w:footnoteReference w:id="2"/>
+      </w:r>
+      <w:r>
+        <w:rPr>
+          <w:lang w:val="fr-CH"/>
+        </w:rPr>
+        <w:t xml:space="preserve"> RES-UL23-HHV1</w:t>
+      </w:r>
     </w:p>
     <w:p>
       <w:pPr>
@@ -403,7 +395,20 @@
       </w:pPr>
       <w:r>
         <w:rPr>
-          <w:color w:val="215E99" w:themeColor="text2" w:themeTint="BF"/>
+          <w:lang w:val="fr-CH"/>
+        </w:rPr>
+      </w:r>
+    </w:p>
+    <w:p>
+      <w:pPr>
+        <w:pStyle w:val="Titre2"/>
+        <w:rPr>
+          <w:lang w:val="fr-CH"/>
+        </w:rPr>
+      </w:pPr>
+      <w:r>
+        <w:rPr>
+          <w:color w:val="215E99" w:themeColor="text2" w:themeTint="bf"/>
           <w:sz w:val="28"/>
           <w:szCs w:val="28"/>
           <w:lang w:val="fr-CH"/>
@@ -411,60 +416,65 @@
         <w:t>Résultat du séquençage du gène UL30</w:t>
       </w:r>
       <w:r>
-        <w:rPr>
-          <w:color w:val="215E99" w:themeColor="text2" w:themeTint="BF"/>
+        <w:fldChar w:fldCharType="begin"/>
+      </w:r>
+      <w:r>
+        <w:rPr>
+          <w:sz w:val="28"/>
+          <w:szCs w:val="28"/>
+          <w:color w:val="215E99"/>
+          <w:lang w:val="fr-CH"/>
+        </w:rPr>
+        <w:instrText xml:space="preserve">NOTEREF _Ref170228208 \h  \* MERGEFORMAT</w:instrText>
+      </w:r>
+      <w:r>
+        <w:rPr>
+          <w:color w:val="215E99" w:themeColor="text2" w:themeTint="bf"/>
+          <w:sz w:val="28"/>
+          <w:szCs w:val="28"/>
+          <w:lang w:val="fr-CH"/>
+        </w:rPr>
+      </w:r>
+      <w:r>
+        <w:rPr>
+          <w:sz w:val="28"/>
+          <w:szCs w:val="28"/>
+          <w:color w:val="215E99"/>
+          <w:lang w:val="fr-CH"/>
+        </w:rPr>
+        <w:fldChar w:fldCharType="separate"/>
+      </w:r>
+      <w:r>
+        <w:rPr>
+          <w:color w:val="215E99" w:themeColor="text2" w:themeTint="bf"/>
+          <w:sz w:val="28"/>
+          <w:szCs w:val="28"/>
+          <w:lang w:val="fr-CH"/>
+        </w:rPr>
+      </w:r>
+      <w:r>
+        <w:rPr>
+          <w:color w:val="215E99" w:themeColor="text2" w:themeTint="bf"/>
           <w:sz w:val="28"/>
           <w:szCs w:val="28"/>
           <w:vertAlign w:val="superscript"/>
           <w:lang w:val="fr-CH"/>
         </w:rPr>
-        <w:fldChar w:fldCharType="begin"/>
-      </w:r>
-      <w:r>
-        <w:rPr>
-          <w:color w:val="215E99" w:themeColor="text2" w:themeTint="BF"/>
-          <w:sz w:val="28"/>
-          <w:szCs w:val="28"/>
-          <w:vertAlign w:val="superscript"/>
-          <w:lang w:val="fr-CH"/>
-        </w:rPr>
-        <w:instrText xml:space="preserve"> NOTEREF _Ref170228208 \h  \* MERGEFORMAT </w:instrText>
-      </w:r>
-      <w:r>
-        <w:rPr>
-          <w:color w:val="215E99" w:themeColor="text2" w:themeTint="BF"/>
-          <w:sz w:val="28"/>
-          <w:szCs w:val="28"/>
-          <w:vertAlign w:val="superscript"/>
-          <w:lang w:val="fr-CH"/>
-        </w:rPr>
-      </w:r>
-      <w:r>
-        <w:rPr>
-          <w:color w:val="215E99" w:themeColor="text2" w:themeTint="BF"/>
-          <w:sz w:val="28"/>
-          <w:szCs w:val="28"/>
-          <w:vertAlign w:val="superscript"/>
-          <w:lang w:val="fr-CH"/>
-        </w:rPr>
-        <w:fldChar w:fldCharType="separate"/>
-      </w:r>
-      <w:r>
-        <w:rPr>
-          <w:color w:val="215E99" w:themeColor="text2" w:themeTint="BF"/>
-          <w:sz w:val="28"/>
-          <w:szCs w:val="28"/>
-          <w:vertAlign w:val="superscript"/>
-          <w:lang w:val="fr-CH"/>
-        </w:rPr>
         <w:t>1</w:t>
       </w:r>
       <w:r>
         <w:rPr>
-          <w:color w:val="215E99" w:themeColor="text2" w:themeTint="BF"/>
+          <w:color w:val="215E99" w:themeColor="text2" w:themeTint="bf"/>
           <w:sz w:val="28"/>
           <w:szCs w:val="28"/>
-          <w:vertAlign w:val="superscript"/>
+          <w:lang w:val="fr-CH"/>
+        </w:rPr>
+      </w:r>
+      <w:r>
+        <w:rPr>
+          <w:sz w:val="28"/>
+          <w:szCs w:val="28"/>
+          <w:color w:val="215E99"/>
           <w:lang w:val="fr-CH"/>
         </w:rPr>
         <w:fldChar w:fldCharType="end"/>
@@ -483,10 +493,17 @@
           <w:lang w:val="fr-CH"/>
         </w:rPr>
       </w:pPr>
+      <w:r>
+        <w:rPr>
+          <w:lang w:val="fr-CH"/>
+        </w:rPr>
+      </w:r>
     </w:p>
     <w:p>
       <w:pPr>
-        <w:rPr>
+        <w:pStyle w:val="Normal"/>
+        <w:rPr>
+          <w:b/>
           <w:b/>
           <w:bCs/>
           <w:sz w:val="28"/>
@@ -498,32 +515,24 @@
         <w:rPr>
           <w:b/>
           <w:bCs/>
-          <w:color w:val="215E99" w:themeColor="text2" w:themeTint="BF"/>
+          <w:color w:val="215E99" w:themeColor="text2" w:themeTint="bf"/>
           <w:sz w:val="28"/>
           <w:szCs w:val="28"/>
           <w:lang w:val="fr-CH"/>
         </w:rPr>
-        <w:t>Conclusion de l’analyse</w:t>
-      </w:r>
-      <w:r>
-        <w:rPr>
-          <w:b/>
-          <w:bCs/>
-          <w:color w:val="215E99" w:themeColor="text2" w:themeTint="BF"/>
-          <w:sz w:val="28"/>
-          <w:szCs w:val="28"/>
-          <w:lang w:val="fr-CH"/>
-        </w:rPr>
-        <w:t> :</w:t>
+        <w:t>Conclusion de l’analyse :</w:t>
       </w:r>
     </w:p>
     <w:p>
       <w:pPr>
+        <w:pStyle w:val="Normal"/>
+        <w:spacing w:before="0" w:after="160"/>
         <w:ind w:firstLine="708"/>
         <w:rPr>
+          <w:b/>
           <w:b/>
           <w:bCs/>
-          <w:color w:val="215E99" w:themeColor="text2" w:themeTint="BF"/>
+          <w:color w:val="215E99" w:themeColor="text2" w:themeTint="bf"/>
           <w:sz w:val="24"/>
           <w:szCs w:val="24"/>
           <w:lang w:val="fr-CH"/>
@@ -537,129 +546,163 @@
       </w:r>
     </w:p>
     <w:sectPr>
-      <w:headerReference w:type="even" r:id="rId6"/>
-      <w:headerReference w:type="default" r:id="rId7"/>
-      <w:footerReference w:type="even" r:id="rId8"/>
-      <w:footerReference w:type="default" r:id="rId9"/>
-      <w:headerReference w:type="first" r:id="rId10"/>
-      <w:footerReference w:type="first" r:id="rId11"/>
+      <w:headerReference w:type="even" r:id="rId2"/>
+      <w:headerReference w:type="default" r:id="rId3"/>
+      <w:headerReference w:type="first" r:id="rId4"/>
+      <w:footerReference w:type="even" r:id="rId5"/>
+      <w:footerReference w:type="default" r:id="rId6"/>
+      <w:footerReference w:type="first" r:id="rId7"/>
       <w:footnotePr>
+        <w:numFmt w:val="decimal"/>
         <w:numRestart w:val="eachPage"/>
       </w:footnotePr>
+      <w:type w:val="nextPage"/>
       <w:pgSz w:w="11906" w:h="16838"/>
-      <w:pgMar w:top="1417" w:right="1417" w:bottom="1417" w:left="1417" w:header="708" w:footer="708" w:gutter="0"/>
-      <w:cols w:space="708"/>
-      <w:docGrid w:linePitch="360"/>
+      <w:pgMar w:left="1417" w:right="1417" w:gutter="0" w:header="708" w:top="1417" w:footer="708" w:bottom="1417"/>
+      <w:pgNumType w:fmt="decimal"/>
+      <w:formProt w:val="false"/>
+      <w:textDirection w:val="lrTb"/>
+      <w:docGrid w:type="default" w:linePitch="360" w:charSpace="0"/>
     </w:sectPr>
   </w:body>
 </w:document>
 </file>
 
-<file path=word/endnotes.xml><?xml version="1.0" encoding="utf-8"?>
-<w:endnotes xmlns:wpc="http://schemas.microsoft.com/office/word/2010/wordprocessingCanvas" xmlns:cx="http://schemas.microsoft.com/office/drawing/2014/chartex" xmlns:cx1="http://schemas.microsoft.com/office/drawing/2015/9/8/chartex" xmlns:cx2="http://schemas.microsoft.com/office/drawing/2015/10/21/chartex" xmlns:cx3="http://schemas.microsoft.com/office/drawing/2016/5/9/chartex" xmlns:cx4="http://schemas.microsoft.com/office/drawing/2016/5/10/chartex" xmlns:cx5="http://schemas.microsoft.com/office/drawing/2016/5/11/chartex" xmlns:cx6="http://schemas.microsoft.com/office/drawing/2016/5/12/chartex" xmlns:cx7="http://schemas.microsoft.com/office/drawing/2016/5/13/chartex" xmlns:cx8="http://schemas.microsoft.com/office/drawing/2016/5/14/chartex" xmlns:mc="http://schemas.openxmlformats.org/markup-compatibility/2006" xmlns:aink="http://schemas.microsoft.com/office/drawing/2016/ink" xmlns:am3d="http://schemas.microsoft.com/office/drawing/2017/model3d" xmlns:o="urn:schemas-microsoft-com:office:office" xmlns:oel="http://schemas.microsoft.com/office/2019/extlst" xmlns:r="http://schemas.openxmlformats.org/officeDocument/2006/relationships" xmlns:m="http://schemas.openxmlformats.org/officeDocument/2006/math" xmlns:v="urn:schemas-microsoft-com:vml" xmlns:wp14="http://schemas.microsoft.com/office/word/2010/wordprocessingDrawing" xmlns:wp="http://schemas.openxmlformats.org/drawingml/2006/wordprocessingDrawing" xmlns:w10="urn:schemas-microsoft-com:office:word" xmlns:w="http://schemas.openxmlformats.org/wordprocessingml/2006/main" xmlns:w14="http://schemas.microsoft.com/office/word/2010/wordml" xmlns:w15="http://schemas.microsoft.com/office/word/2012/wordml" xmlns:w16cex="http://schemas.microsoft.com/office/word/2018/wordml/cex" xmlns:w16cid="http://schemas.microsoft.com/office/word/2016/wordml/cid" xmlns:w16="http://schemas.microsoft.com/office/word/2018/wordml" xmlns:w16du="http://schemas.microsoft.com/office/word/2023/wordml/word16du" xmlns:w16sdtdh="http://schemas.microsoft.com/office/word/2020/wordml/sdtdatahash" xmlns:w16se="http://schemas.microsoft.com/office/word/2015/wordml/symex" xmlns:wpg="http://schemas.microsoft.com/office/word/2010/wordprocessingGroup" xmlns:wpi="http://schemas.microsoft.com/office/word/2010/wordprocessingInk" xmlns:wne="http://schemas.microsoft.com/office/word/2006/wordml" xmlns:wps="http://schemas.microsoft.com/office/word/2010/wordprocessingShape" mc:Ignorable="w14 w15 w16se w16cid w16 w16cex w16sdtdh w16du wp14">
-  <w:endnote w:type="separator" w:id="-1">
-    <w:p>
-      <w:pPr>
-        <w:spacing w:after="0" w:line="240" w:lineRule="auto"/>
-      </w:pPr>
-      <w:r>
-        <w:separator/>
-      </w:r>
-    </w:p>
-  </w:endnote>
-  <w:endnote w:type="continuationSeparator" w:id="0">
-    <w:p>
-      <w:pPr>
-        <w:spacing w:after="0" w:line="240" w:lineRule="auto"/>
-      </w:pPr>
-      <w:r>
-        <w:continuationSeparator/>
-      </w:r>
-    </w:p>
-  </w:endnote>
-</w:endnotes>
-</file>
-
 <file path=word/footer1.xml><?xml version="1.0" encoding="utf-8"?>
-<w:ftr xmlns:wpc="http://schemas.microsoft.com/office/word/2010/wordprocessingCanvas" xmlns:cx="http://schemas.microsoft.com/office/drawing/2014/chartex" xmlns:cx1="http://schemas.microsoft.com/office/drawing/2015/9/8/chartex" xmlns:cx2="http://schemas.microsoft.com/office/drawing/2015/10/21/chartex" xmlns:cx3="http://schemas.microsoft.com/office/drawing/2016/5/9/chartex" xmlns:cx4="http://schemas.microsoft.com/office/drawing/2016/5/10/chartex" xmlns:cx5="http://schemas.microsoft.com/office/drawing/2016/5/11/chartex" xmlns:cx6="http://schemas.microsoft.com/office/drawing/2016/5/12/chartex" xmlns:cx7="http://schemas.microsoft.com/office/drawing/2016/5/13/chartex" xmlns:cx8="http://schemas.microsoft.com/office/drawing/2016/5/14/chartex" xmlns:mc="http://schemas.openxmlformats.org/markup-compatibility/2006" xmlns:aink="http://schemas.microsoft.com/office/drawing/2016/ink" xmlns:am3d="http://schemas.microsoft.com/office/drawing/2017/model3d" xmlns:o="urn:schemas-microsoft-com:office:office" xmlns:oel="http://schemas.microsoft.com/office/2019/extlst" xmlns:r="http://schemas.openxmlformats.org/officeDocument/2006/relationships" xmlns:m="http://schemas.openxmlformats.org/officeDocument/2006/math" xmlns:v="urn:schemas-microsoft-com:vml" xmlns:wp14="http://schemas.microsoft.com/office/word/2010/wordprocessingDrawing" xmlns:wp="http://schemas.openxmlformats.org/drawingml/2006/wordprocessingDrawing" xmlns:w10="urn:schemas-microsoft-com:office:word" xmlns:w="http://schemas.openxmlformats.org/wordprocessingml/2006/main" xmlns:w14="http://schemas.microsoft.com/office/word/2010/wordml" xmlns:w15="http://schemas.microsoft.com/office/word/2012/wordml" xmlns:w16cex="http://schemas.microsoft.com/office/word/2018/wordml/cex" xmlns:w16cid="http://schemas.microsoft.com/office/word/2016/wordml/cid" xmlns:w16="http://schemas.microsoft.com/office/word/2018/wordml" xmlns:w16du="http://schemas.microsoft.com/office/word/2023/wordml/word16du" xmlns:w16sdtdh="http://schemas.microsoft.com/office/word/2020/wordml/sdtdatahash" xmlns:w16se="http://schemas.microsoft.com/office/word/2015/wordml/symex" xmlns:wpg="http://schemas.microsoft.com/office/word/2010/wordprocessingGroup" xmlns:wpi="http://schemas.microsoft.com/office/word/2010/wordprocessingInk" xmlns:wne="http://schemas.microsoft.com/office/word/2006/wordml" xmlns:wps="http://schemas.microsoft.com/office/word/2010/wordprocessingShape" mc:Ignorable="w14 w15 w16se w16cid w16 w16cex w16sdtdh w16du wp14">
+<w:ftr xmlns:o="urn:schemas-microsoft-com:office:office" xmlns:r="http://schemas.openxmlformats.org/officeDocument/2006/relationships" xmlns:v="urn:schemas-microsoft-com:vml" xmlns:w="http://schemas.openxmlformats.org/wordprocessingml/2006/main" xmlns:w10="urn:schemas-microsoft-com:office:word" xmlns:wp="http://schemas.openxmlformats.org/drawingml/2006/wordprocessingDrawing" xmlns:wps="http://schemas.microsoft.com/office/word/2010/wordprocessingShape" xmlns:wpg="http://schemas.microsoft.com/office/word/2010/wordprocessingGroup" xmlns:mc="http://schemas.openxmlformats.org/markup-compatibility/2006" xmlns:wp14="http://schemas.microsoft.com/office/word/2010/wordprocessingDrawing" xmlns:w14="http://schemas.microsoft.com/office/word/2010/wordml" xmlns:w15="http://schemas.microsoft.com/office/word/2012/wordml" mc:Ignorable="w14 wp14 w15">
   <w:p>
     <w:pPr>
       <w:pStyle w:val="Pieddepage"/>
-    </w:pPr>
+      <w:rPr/>
+    </w:pPr>
+    <w:r>
+      <w:rPr/>
+    </w:r>
   </w:p>
 </w:ftr>
 </file>
 
 <file path=word/footer2.xml><?xml version="1.0" encoding="utf-8"?>
-<w:ftr xmlns:wpc="http://schemas.microsoft.com/office/word/2010/wordprocessingCanvas" xmlns:cx="http://schemas.microsoft.com/office/drawing/2014/chartex" xmlns:cx1="http://schemas.microsoft.com/office/drawing/2015/9/8/chartex" xmlns:cx2="http://schemas.microsoft.com/office/drawing/2015/10/21/chartex" xmlns:cx3="http://schemas.microsoft.com/office/drawing/2016/5/9/chartex" xmlns:cx4="http://schemas.microsoft.com/office/drawing/2016/5/10/chartex" xmlns:cx5="http://schemas.microsoft.com/office/drawing/2016/5/11/chartex" xmlns:cx6="http://schemas.microsoft.com/office/drawing/2016/5/12/chartex" xmlns:cx7="http://schemas.microsoft.com/office/drawing/2016/5/13/chartex" xmlns:cx8="http://schemas.microsoft.com/office/drawing/2016/5/14/chartex" xmlns:mc="http://schemas.openxmlformats.org/markup-compatibility/2006" xmlns:aink="http://schemas.microsoft.com/office/drawing/2016/ink" xmlns:am3d="http://schemas.microsoft.com/office/drawing/2017/model3d" xmlns:o="urn:schemas-microsoft-com:office:office" xmlns:oel="http://schemas.microsoft.com/office/2019/extlst" xmlns:r="http://schemas.openxmlformats.org/officeDocument/2006/relationships" xmlns:m="http://schemas.openxmlformats.org/officeDocument/2006/math" xmlns:v="urn:schemas-microsoft-com:vml" xmlns:wp14="http://schemas.microsoft.com/office/word/2010/wordprocessingDrawing" xmlns:wp="http://schemas.openxmlformats.org/drawingml/2006/wordprocessingDrawing" xmlns:w10="urn:schemas-microsoft-com:office:word" xmlns:w="http://schemas.openxmlformats.org/wordprocessingml/2006/main" xmlns:w14="http://schemas.microsoft.com/office/word/2010/wordml" xmlns:w15="http://schemas.microsoft.com/office/word/2012/wordml" xmlns:w16cex="http://schemas.microsoft.com/office/word/2018/wordml/cex" xmlns:w16cid="http://schemas.microsoft.com/office/word/2016/wordml/cid" xmlns:w16="http://schemas.microsoft.com/office/word/2018/wordml" xmlns:w16du="http://schemas.microsoft.com/office/word/2023/wordml/word16du" xmlns:w16sdtdh="http://schemas.microsoft.com/office/word/2020/wordml/sdtdatahash" xmlns:w16se="http://schemas.microsoft.com/office/word/2015/wordml/symex" xmlns:wpg="http://schemas.microsoft.com/office/word/2010/wordprocessingGroup" xmlns:wpi="http://schemas.microsoft.com/office/word/2010/wordprocessingInk" xmlns:wne="http://schemas.microsoft.com/office/word/2006/wordml" xmlns:wps="http://schemas.microsoft.com/office/word/2010/wordprocessingShape" mc:Ignorable="w14 w15 w16se w16cid w16 w16cex w16sdtdh w16du wp14">
+<w:ftr xmlns:o="urn:schemas-microsoft-com:office:office" xmlns:r="http://schemas.openxmlformats.org/officeDocument/2006/relationships" xmlns:v="urn:schemas-microsoft-com:vml" xmlns:w="http://schemas.openxmlformats.org/wordprocessingml/2006/main" xmlns:w10="urn:schemas-microsoft-com:office:word" xmlns:wp="http://schemas.openxmlformats.org/drawingml/2006/wordprocessingDrawing" xmlns:wps="http://schemas.microsoft.com/office/word/2010/wordprocessingShape" xmlns:wpg="http://schemas.microsoft.com/office/word/2010/wordprocessingGroup" xmlns:mc="http://schemas.openxmlformats.org/markup-compatibility/2006" xmlns:wp14="http://schemas.microsoft.com/office/word/2010/wordprocessingDrawing" xmlns:w14="http://schemas.microsoft.com/office/word/2010/wordml" xmlns:w15="http://schemas.microsoft.com/office/word/2012/wordml" mc:Ignorable="w14 wp14 w15">
   <w:p>
     <w:pPr>
       <w:pStyle w:val="Pieddepage"/>
       <w:rPr>
-        <w:rFonts w:asciiTheme="majorHAnsi" w:hAnsiTheme="majorHAnsi" w:cstheme="majorHAnsi"/>
+        <w:rFonts w:ascii="Aptos Display" w:hAnsi="Aptos Display" w:cs="Aptos Display" w:asciiTheme="majorHAnsi" w:cstheme="majorHAnsi" w:hAnsiTheme="majorHAnsi"/>
         <w:lang w:val="fr-CH"/>
       </w:rPr>
     </w:pPr>
-  </w:p>
-  <w:p>
-    <w:pPr>
-      <w:pStyle w:val="Pieddepage"/>
-      <w:jc w:val="center"/>
-      <w:rPr>
+    <w:r>
+      <w:rPr>
+        <w:rFonts w:cs="Aptos Display" w:cstheme="majorHAnsi" w:ascii="Aptos Display" w:hAnsi="Aptos Display"/>
         <w:lang w:val="fr-CH"/>
       </w:rPr>
-    </w:pPr>
-    <w:r>
-      <w:rPr>
-        <w:lang w:val="fr-CH"/>
-      </w:rPr>
-      <w:t>Rue Gabrielle-Perret-Gentil 4, 1211 Genève 14, Suisse – T. +41 22 372 49 92 – F +41 22 372 40 97</w:t>
     </w:r>
   </w:p>
   <w:p>
     <w:pPr>
       <w:pStyle w:val="Pieddepage"/>
+      <w:jc w:val="center"/>
       <w:rPr>
         <w:lang w:val="fr-CH"/>
       </w:rPr>
     </w:pPr>
+    <w:r>
+      <w:rPr>
+        <w:lang w:val="fr-CH"/>
+      </w:rPr>
+    </w:r>
+  </w:p>
+  <w:p>
+    <w:pPr>
+      <w:pStyle w:val="Pieddepage"/>
+      <w:rPr>
+        <w:lang w:val="fr-CH"/>
+      </w:rPr>
+    </w:pPr>
+    <w:r>
+      <w:rPr>
+        <w:lang w:val="fr-CH"/>
+      </w:rPr>
+    </w:r>
   </w:p>
 </w:ftr>
 </file>
 
 <file path=word/footer3.xml><?xml version="1.0" encoding="utf-8"?>
-<w:ftr xmlns:wpc="http://schemas.microsoft.com/office/word/2010/wordprocessingCanvas" xmlns:cx="http://schemas.microsoft.com/office/drawing/2014/chartex" xmlns:cx1="http://schemas.microsoft.com/office/drawing/2015/9/8/chartex" xmlns:cx2="http://schemas.microsoft.com/office/drawing/2015/10/21/chartex" xmlns:cx3="http://schemas.microsoft.com/office/drawing/2016/5/9/chartex" xmlns:cx4="http://schemas.microsoft.com/office/drawing/2016/5/10/chartex" xmlns:cx5="http://schemas.microsoft.com/office/drawing/2016/5/11/chartex" xmlns:cx6="http://schemas.microsoft.com/office/drawing/2016/5/12/chartex" xmlns:cx7="http://schemas.microsoft.com/office/drawing/2016/5/13/chartex" xmlns:cx8="http://schemas.microsoft.com/office/drawing/2016/5/14/chartex" xmlns:mc="http://schemas.openxmlformats.org/markup-compatibility/2006" xmlns:aink="http://schemas.microsoft.com/office/drawing/2016/ink" xmlns:am3d="http://schemas.microsoft.com/office/drawing/2017/model3d" xmlns:o="urn:schemas-microsoft-com:office:office" xmlns:oel="http://schemas.microsoft.com/office/2019/extlst" xmlns:r="http://schemas.openxmlformats.org/officeDocument/2006/relationships" xmlns:m="http://schemas.openxmlformats.org/officeDocument/2006/math" xmlns:v="urn:schemas-microsoft-com:vml" xmlns:wp14="http://schemas.microsoft.com/office/word/2010/wordprocessingDrawing" xmlns:wp="http://schemas.openxmlformats.org/drawingml/2006/wordprocessingDrawing" xmlns:w10="urn:schemas-microsoft-com:office:word" xmlns:w="http://schemas.openxmlformats.org/wordprocessingml/2006/main" xmlns:w14="http://schemas.microsoft.com/office/word/2010/wordml" xmlns:w15="http://schemas.microsoft.com/office/word/2012/wordml" xmlns:w16cex="http://schemas.microsoft.com/office/word/2018/wordml/cex" xmlns:w16cid="http://schemas.microsoft.com/office/word/2016/wordml/cid" xmlns:w16="http://schemas.microsoft.com/office/word/2018/wordml" xmlns:w16du="http://schemas.microsoft.com/office/word/2023/wordml/word16du" xmlns:w16sdtdh="http://schemas.microsoft.com/office/word/2020/wordml/sdtdatahash" xmlns:w16se="http://schemas.microsoft.com/office/word/2015/wordml/symex" xmlns:wpg="http://schemas.microsoft.com/office/word/2010/wordprocessingGroup" xmlns:wpi="http://schemas.microsoft.com/office/word/2010/wordprocessingInk" xmlns:wne="http://schemas.microsoft.com/office/word/2006/wordml" xmlns:wps="http://schemas.microsoft.com/office/word/2010/wordprocessingShape" mc:Ignorable="w14 w15 w16se w16cid w16 w16cex w16sdtdh w16du wp14">
+<w:ftr xmlns:o="urn:schemas-microsoft-com:office:office" xmlns:r="http://schemas.openxmlformats.org/officeDocument/2006/relationships" xmlns:v="urn:schemas-microsoft-com:vml" xmlns:w="http://schemas.openxmlformats.org/wordprocessingml/2006/main" xmlns:w10="urn:schemas-microsoft-com:office:word" xmlns:wp="http://schemas.openxmlformats.org/drawingml/2006/wordprocessingDrawing" xmlns:wps="http://schemas.microsoft.com/office/word/2010/wordprocessingShape" xmlns:wpg="http://schemas.microsoft.com/office/word/2010/wordprocessingGroup" xmlns:mc="http://schemas.openxmlformats.org/markup-compatibility/2006" xmlns:wp14="http://schemas.microsoft.com/office/word/2010/wordprocessingDrawing" xmlns:w14="http://schemas.microsoft.com/office/word/2010/wordml" xmlns:w15="http://schemas.microsoft.com/office/word/2012/wordml" mc:Ignorable="w14 wp14 w15">
   <w:p>
     <w:pPr>
       <w:pStyle w:val="Pieddepage"/>
-    </w:pPr>
+      <w:rPr>
+        <w:rFonts w:ascii="Aptos Display" w:hAnsi="Aptos Display" w:cs="Aptos Display" w:asciiTheme="majorHAnsi" w:cstheme="majorHAnsi" w:hAnsiTheme="majorHAnsi"/>
+        <w:lang w:val="fr-CH"/>
+      </w:rPr>
+    </w:pPr>
+    <w:r>
+      <w:rPr>
+        <w:rFonts w:cs="Aptos Display" w:cstheme="majorHAnsi" w:ascii="Aptos Display" w:hAnsi="Aptos Display"/>
+        <w:lang w:val="fr-CH"/>
+      </w:rPr>
+    </w:r>
+  </w:p>
+  <w:p>
+    <w:pPr>
+      <w:pStyle w:val="Pieddepage"/>
+      <w:jc w:val="center"/>
+      <w:rPr>
+        <w:lang w:val="fr-CH"/>
+      </w:rPr>
+    </w:pPr>
+    <w:r>
+      <w:rPr>
+        <w:lang w:val="fr-CH"/>
+      </w:rPr>
+    </w:r>
+  </w:p>
+  <w:p>
+    <w:pPr>
+      <w:pStyle w:val="Pieddepage"/>
+      <w:rPr>
+        <w:lang w:val="fr-CH"/>
+      </w:rPr>
+    </w:pPr>
+    <w:r>
+      <w:rPr>
+        <w:lang w:val="fr-CH"/>
+      </w:rPr>
+    </w:r>
   </w:p>
 </w:ftr>
 </file>
 
 <file path=word/footnotes.xml><?xml version="1.0" encoding="utf-8"?>
-<w:footnotes xmlns:wpc="http://schemas.microsoft.com/office/word/2010/wordprocessingCanvas" xmlns:cx="http://schemas.microsoft.com/office/drawing/2014/chartex" xmlns:cx1="http://schemas.microsoft.com/office/drawing/2015/9/8/chartex" xmlns:cx2="http://schemas.microsoft.com/office/drawing/2015/10/21/chartex" xmlns:cx3="http://schemas.microsoft.com/office/drawing/2016/5/9/chartex" xmlns:cx4="http://schemas.microsoft.com/office/drawing/2016/5/10/chartex" xmlns:cx5="http://schemas.microsoft.com/office/drawing/2016/5/11/chartex" xmlns:cx6="http://schemas.microsoft.com/office/drawing/2016/5/12/chartex" xmlns:cx7="http://schemas.microsoft.com/office/drawing/2016/5/13/chartex" xmlns:cx8="http://schemas.microsoft.com/office/drawing/2016/5/14/chartex" xmlns:mc="http://schemas.openxmlformats.org/markup-compatibility/2006" xmlns:aink="http://schemas.microsoft.com/office/drawing/2016/ink" xmlns:am3d="http://schemas.microsoft.com/office/drawing/2017/model3d" xmlns:o="urn:schemas-microsoft-com:office:office" xmlns:oel="http://schemas.microsoft.com/office/2019/extlst" xmlns:r="http://schemas.openxmlformats.org/officeDocument/2006/relationships" xmlns:m="http://schemas.openxmlformats.org/officeDocument/2006/math" xmlns:v="urn:schemas-microsoft-com:vml" xmlns:wp14="http://schemas.microsoft.com/office/word/2010/wordprocessingDrawing" xmlns:wp="http://schemas.openxmlformats.org/drawingml/2006/wordprocessingDrawing" xmlns:w10="urn:schemas-microsoft-com:office:word" xmlns:w="http://schemas.openxmlformats.org/wordprocessingml/2006/main" xmlns:w14="http://schemas.microsoft.com/office/word/2010/wordml" xmlns:w15="http://schemas.microsoft.com/office/word/2012/wordml" xmlns:w16cex="http://schemas.microsoft.com/office/word/2018/wordml/cex" xmlns:w16cid="http://schemas.microsoft.com/office/word/2016/wordml/cid" xmlns:w16="http://schemas.microsoft.com/office/word/2018/wordml" xmlns:w16du="http://schemas.microsoft.com/office/word/2023/wordml/word16du" xmlns:w16sdtdh="http://schemas.microsoft.com/office/word/2020/wordml/sdtdatahash" xmlns:w16se="http://schemas.microsoft.com/office/word/2015/wordml/symex" xmlns:wpg="http://schemas.microsoft.com/office/word/2010/wordprocessingGroup" xmlns:wpi="http://schemas.microsoft.com/office/word/2010/wordprocessingInk" xmlns:wne="http://schemas.microsoft.com/office/word/2006/wordml" xmlns:wps="http://schemas.microsoft.com/office/word/2010/wordprocessingShape" mc:Ignorable="w14 w15 w16se w16cid w16 w16cex w16sdtdh w16du wp14">
-  <w:footnote w:type="separator" w:id="-1">
+<w:footnotes xmlns:o="urn:schemas-microsoft-com:office:office" xmlns:r="http://schemas.openxmlformats.org/officeDocument/2006/relationships" xmlns:v="urn:schemas-microsoft-com:vml" xmlns:w="http://schemas.openxmlformats.org/wordprocessingml/2006/main" xmlns:w10="urn:schemas-microsoft-com:office:word" xmlns:wp="http://schemas.openxmlformats.org/drawingml/2006/wordprocessingDrawing" xmlns:wps="http://schemas.microsoft.com/office/word/2010/wordprocessingShape" xmlns:wpg="http://schemas.microsoft.com/office/word/2010/wordprocessingGroup" xmlns:mc="http://schemas.openxmlformats.org/markup-compatibility/2006" xmlns:wp14="http://schemas.microsoft.com/office/word/2010/wordprocessingDrawing" xmlns:w14="http://schemas.microsoft.com/office/word/2010/wordml" xmlns:w15="http://schemas.microsoft.com/office/word/2012/wordml" mc:Ignorable="w14 wp14 w15">
+  <w:footnote w:id="0" w:type="separator">
     <w:p>
       <w:pPr>
-        <w:spacing w:after="0" w:line="240" w:lineRule="auto"/>
+        <w:rPr>
+          <w:sz w:val="12"/>
+        </w:rPr>
       </w:pPr>
       <w:r>
         <w:separator/>
       </w:r>
     </w:p>
   </w:footnote>
-  <w:footnote w:type="continuationSeparator" w:id="0">
+  <w:footnote w:id="1" w:type="continuationSeparator">
     <w:p>
       <w:pPr>
-        <w:spacing w:after="0" w:line="240" w:lineRule="auto"/>
+        <w:rPr>
+          <w:sz w:val="12"/>
+        </w:rPr>
       </w:pPr>
       <w:r>
         <w:continuationSeparator/>
       </w:r>
     </w:p>
   </w:footnote>
-  <w:footnote w:id="1">
+  <w:footnote w:id="2">
     <w:p>
       <w:pPr>
         <w:pStyle w:val="Notedebasdepage"/>
@@ -669,7 +712,7 @@
       </w:pPr>
       <w:r>
         <w:rPr>
-          <w:rStyle w:val="Appelnotedebasdep"/>
+          <w:rStyle w:val="Caractresdenotedebasdepage"/>
         </w:rPr>
         <w:footnoteRef/>
       </w:r>
@@ -677,49 +720,7 @@
         <w:rPr>
           <w:lang w:val="fr-CH"/>
         </w:rPr>
-        <w:t xml:space="preserve"> Résultat non accrédité</w:t>
-      </w:r>
-      <w:r>
-        <w:rPr>
-          <w:lang w:val="fr-CH"/>
-        </w:rPr>
-        <w:t>.</w:t>
-      </w:r>
-      <w:r>
-        <w:rPr>
-          <w:lang w:val="fr-CH"/>
-        </w:rPr>
-        <w:t xml:space="preserve"> Séquençage avec la technologie Oxford Nanopore à lectures longues. </w:t>
-      </w:r>
-      <w:r>
-        <w:rPr>
-          <w:lang w:val="fr-CH"/>
-        </w:rPr>
-        <w:t xml:space="preserve">Séquençage comparé à la souche de </w:t>
-      </w:r>
-      <w:r>
-        <w:rPr>
-          <w:lang w:val="fr-CH"/>
-        </w:rPr>
-        <w:t xml:space="preserve">référence </w:t>
-      </w:r>
-      <w:r>
-        <w:rPr>
-          <w:lang w:val="fr-CH"/>
-        </w:rPr>
-        <w:t xml:space="preserve">NC_001806.2 </w:t>
-      </w:r>
-      <w:r>
-        <w:rPr>
-          <w:lang w:val="fr-CH"/>
-        </w:rPr>
-        <w:t>connu susceptible</w:t>
-      </w:r>
-      <w:r>
-        <w:rPr>
-          <w:lang w:val="fr-CH"/>
-        </w:rPr>
-        <w:t>.</w:t>
+        <w:t>Séquençage comparé à la souche de référence NC_001806.2 connu susceptible.</w:t>
       </w:r>
     </w:p>
     <w:p>
@@ -733,19 +734,7 @@
         <w:rPr>
           <w:lang w:val="fr-CH"/>
         </w:rPr>
-        <w:t xml:space="preserve">* Ce symbole représente la formation d’un codon d’arrêt </w:t>
-      </w:r>
-      <w:r>
-        <w:rPr>
-          <w:lang w:val="fr-CH"/>
-        </w:rPr>
-        <w:t xml:space="preserve">prématuré </w:t>
-      </w:r>
-      <w:r>
-        <w:rPr>
-          <w:lang w:val="fr-CH"/>
-        </w:rPr>
-        <w:t>de la traduction.</w:t>
+        <w:t>* Ce symbole représente la formation d’un codon d’arrêt prématuré de la traduction.</w:t>
       </w:r>
     </w:p>
   </w:footnote>
@@ -753,331 +742,71 @@
 </file>
 
 <file path=word/header1.xml><?xml version="1.0" encoding="utf-8"?>
-<w:hdr xmlns:wpc="http://schemas.microsoft.com/office/word/2010/wordprocessingCanvas" xmlns:cx="http://schemas.microsoft.com/office/drawing/2014/chartex" xmlns:cx1="http://schemas.microsoft.com/office/drawing/2015/9/8/chartex" xmlns:cx2="http://schemas.microsoft.com/office/drawing/2015/10/21/chartex" xmlns:cx3="http://schemas.microsoft.com/office/drawing/2016/5/9/chartex" xmlns:cx4="http://schemas.microsoft.com/office/drawing/2016/5/10/chartex" xmlns:cx5="http://schemas.microsoft.com/office/drawing/2016/5/11/chartex" xmlns:cx6="http://schemas.microsoft.com/office/drawing/2016/5/12/chartex" xmlns:cx7="http://schemas.microsoft.com/office/drawing/2016/5/13/chartex" xmlns:cx8="http://schemas.microsoft.com/office/drawing/2016/5/14/chartex" xmlns:mc="http://schemas.openxmlformats.org/markup-compatibility/2006" xmlns:aink="http://schemas.microsoft.com/office/drawing/2016/ink" xmlns:am3d="http://schemas.microsoft.com/office/drawing/2017/model3d" xmlns:o="urn:schemas-microsoft-com:office:office" xmlns:oel="http://schemas.microsoft.com/office/2019/extlst" xmlns:r="http://schemas.openxmlformats.org/officeDocument/2006/relationships" xmlns:m="http://schemas.openxmlformats.org/officeDocument/2006/math" xmlns:v="urn:schemas-microsoft-com:vml" xmlns:wp14="http://schemas.microsoft.com/office/word/2010/wordprocessingDrawing" xmlns:wp="http://schemas.openxmlformats.org/drawingml/2006/wordprocessingDrawing" xmlns:w10="urn:schemas-microsoft-com:office:word" xmlns:w="http://schemas.openxmlformats.org/wordprocessingml/2006/main" xmlns:w14="http://schemas.microsoft.com/office/word/2010/wordml" xmlns:w15="http://schemas.microsoft.com/office/word/2012/wordml" xmlns:w16cex="http://schemas.microsoft.com/office/word/2018/wordml/cex" xmlns:w16cid="http://schemas.microsoft.com/office/word/2016/wordml/cid" xmlns:w16="http://schemas.microsoft.com/office/word/2018/wordml" xmlns:w16du="http://schemas.microsoft.com/office/word/2023/wordml/word16du" xmlns:w16sdtdh="http://schemas.microsoft.com/office/word/2020/wordml/sdtdatahash" xmlns:w16se="http://schemas.microsoft.com/office/word/2015/wordml/symex" xmlns:wpg="http://schemas.microsoft.com/office/word/2010/wordprocessingGroup" xmlns:wpi="http://schemas.microsoft.com/office/word/2010/wordprocessingInk" xmlns:wne="http://schemas.microsoft.com/office/word/2006/wordml" xmlns:wps="http://schemas.microsoft.com/office/word/2010/wordprocessingShape" mc:Ignorable="w14 w15 w16se w16cid w16 w16cex w16sdtdh w16du wp14">
+<w:hdr xmlns:o="urn:schemas-microsoft-com:office:office" xmlns:r="http://schemas.openxmlformats.org/officeDocument/2006/relationships" xmlns:v="urn:schemas-microsoft-com:vml" xmlns:w="http://schemas.openxmlformats.org/wordprocessingml/2006/main" xmlns:w10="urn:schemas-microsoft-com:office:word" xmlns:wp="http://schemas.openxmlformats.org/drawingml/2006/wordprocessingDrawing" xmlns:wps="http://schemas.microsoft.com/office/word/2010/wordprocessingShape" xmlns:wpg="http://schemas.microsoft.com/office/word/2010/wordprocessingGroup" xmlns:mc="http://schemas.openxmlformats.org/markup-compatibility/2006" xmlns:wp14="http://schemas.microsoft.com/office/word/2010/wordprocessingDrawing" xmlns:w14="http://schemas.microsoft.com/office/word/2010/wordml" xmlns:w15="http://schemas.microsoft.com/office/word/2012/wordml" mc:Ignorable="w14 wp14 w15">
   <w:p>
     <w:pPr>
-      <w:pStyle w:val="En-tte"/>
-    </w:pPr>
+      <w:pStyle w:val="Entte"/>
+      <w:rPr/>
+    </w:pPr>
+    <w:r>
+      <w:rPr/>
+    </w:r>
   </w:p>
 </w:hdr>
 </file>
 
 <file path=word/header2.xml><?xml version="1.0" encoding="utf-8"?>
-<w:hdr xmlns:wpc="http://schemas.microsoft.com/office/word/2010/wordprocessingCanvas" xmlns:cx="http://schemas.microsoft.com/office/drawing/2014/chartex" xmlns:cx1="http://schemas.microsoft.com/office/drawing/2015/9/8/chartex" xmlns:cx2="http://schemas.microsoft.com/office/drawing/2015/10/21/chartex" xmlns:cx3="http://schemas.microsoft.com/office/drawing/2016/5/9/chartex" xmlns:cx4="http://schemas.microsoft.com/office/drawing/2016/5/10/chartex" xmlns:cx5="http://schemas.microsoft.com/office/drawing/2016/5/11/chartex" xmlns:cx6="http://schemas.microsoft.com/office/drawing/2016/5/12/chartex" xmlns:cx7="http://schemas.microsoft.com/office/drawing/2016/5/13/chartex" xmlns:cx8="http://schemas.microsoft.com/office/drawing/2016/5/14/chartex" xmlns:mc="http://schemas.openxmlformats.org/markup-compatibility/2006" xmlns:aink="http://schemas.microsoft.com/office/drawing/2016/ink" xmlns:am3d="http://schemas.microsoft.com/office/drawing/2017/model3d" xmlns:o="urn:schemas-microsoft-com:office:office" xmlns:oel="http://schemas.microsoft.com/office/2019/extlst" xmlns:r="http://schemas.openxmlformats.org/officeDocument/2006/relationships" xmlns:m="http://schemas.openxmlformats.org/officeDocument/2006/math" xmlns:v="urn:schemas-microsoft-com:vml" xmlns:wp14="http://schemas.microsoft.com/office/word/2010/wordprocessingDrawing" xmlns:wp="http://schemas.openxmlformats.org/drawingml/2006/wordprocessingDrawing" xmlns:w10="urn:schemas-microsoft-com:office:word" xmlns:w="http://schemas.openxmlformats.org/wordprocessingml/2006/main" xmlns:w14="http://schemas.microsoft.com/office/word/2010/wordml" xmlns:w15="http://schemas.microsoft.com/office/word/2012/wordml" xmlns:w16cex="http://schemas.microsoft.com/office/word/2018/wordml/cex" xmlns:w16cid="http://schemas.microsoft.com/office/word/2016/wordml/cid" xmlns:w16="http://schemas.microsoft.com/office/word/2018/wordml" xmlns:w16du="http://schemas.microsoft.com/office/word/2023/wordml/word16du" xmlns:w16sdtdh="http://schemas.microsoft.com/office/word/2020/wordml/sdtdatahash" xmlns:w16se="http://schemas.microsoft.com/office/word/2015/wordml/symex" xmlns:wpg="http://schemas.microsoft.com/office/word/2010/wordprocessingGroup" xmlns:wpi="http://schemas.microsoft.com/office/word/2010/wordprocessingInk" xmlns:wne="http://schemas.microsoft.com/office/word/2006/wordml" xmlns:wps="http://schemas.microsoft.com/office/word/2010/wordprocessingShape" mc:Ignorable="w14 w15 w16se w16cid w16 w16cex w16sdtdh w16du wp14">
+<w:hdr xmlns:o="urn:schemas-microsoft-com:office:office" xmlns:r="http://schemas.openxmlformats.org/officeDocument/2006/relationships" xmlns:v="urn:schemas-microsoft-com:vml" xmlns:w="http://schemas.openxmlformats.org/wordprocessingml/2006/main" xmlns:w10="urn:schemas-microsoft-com:office:word" xmlns:wp="http://schemas.openxmlformats.org/drawingml/2006/wordprocessingDrawing" xmlns:wps="http://schemas.microsoft.com/office/word/2010/wordprocessingShape" xmlns:wpg="http://schemas.microsoft.com/office/word/2010/wordprocessingGroup" xmlns:mc="http://schemas.openxmlformats.org/markup-compatibility/2006" xmlns:wp14="http://schemas.microsoft.com/office/word/2010/wordprocessingDrawing" xmlns:w14="http://schemas.microsoft.com/office/word/2010/wordml" xmlns:w15="http://schemas.microsoft.com/office/word/2012/wordml" mc:Ignorable="w14 wp14 w15">
   <w:p>
     <w:pPr>
-      <w:pStyle w:val="En-tte"/>
+      <w:pStyle w:val="Entte"/>
+      <w:rPr/>
     </w:pPr>
     <w:r>
-      <w:rPr>
-        <w:rFonts w:ascii="Arial" w:hAnsi="Arial" w:cs="Arial"/>
-        <w:noProof/>
-        <w:lang w:eastAsia="fr-CH"/>
-      </w:rPr>
-      <mc:AlternateContent>
-        <mc:Choice Requires="wps">
-          <w:drawing>
-            <wp:anchor distT="0" distB="0" distL="114300" distR="114300" simplePos="0" relativeHeight="251659264" behindDoc="0" locked="1" layoutInCell="1" allowOverlap="1" wp14:anchorId="283AC564" wp14:editId="1EFD1CF3">
-              <wp:simplePos x="0" y="0"/>
-              <wp:positionH relativeFrom="column">
-                <wp:posOffset>79375</wp:posOffset>
-              </wp:positionH>
-              <wp:positionV relativeFrom="page">
-                <wp:posOffset>1381760</wp:posOffset>
-              </wp:positionV>
-              <wp:extent cx="1187450" cy="478790"/>
-              <wp:effectExtent l="0" t="0" r="0" b="0"/>
-              <wp:wrapNone/>
-              <wp:docPr id="25" name="Zone de texte 25"/>
-              <wp:cNvGraphicFramePr>
-                <a:graphicFrameLocks xmlns:a="http://schemas.openxmlformats.org/drawingml/2006/main"/>
-              </wp:cNvGraphicFramePr>
-              <a:graphic xmlns:a="http://schemas.openxmlformats.org/drawingml/2006/main">
-                <a:graphicData uri="http://schemas.microsoft.com/office/word/2010/wordprocessingShape">
-                  <wps:wsp>
-                    <wps:cNvSpPr txBox="1">
-                      <a:spLocks/>
-                    </wps:cNvSpPr>
-                    <wps:spPr>
-                      <a:xfrm>
-                        <a:off x="0" y="0"/>
-                        <a:ext cx="1187450" cy="478790"/>
-                      </a:xfrm>
-                      <a:prstGeom prst="rect">
-                        <a:avLst/>
-                      </a:prstGeom>
-                      <a:noFill/>
-                      <a:ln>
-                        <a:noFill/>
-                      </a:ln>
-                      <a:effectLst/>
-                      <a:extLst>
-                        <a:ext uri="{C572A759-6A51-4108-AA02-DFA0A04FC94B}">
-                          <ma14:wrappingTextBoxFlag xmlns:o="urn:schemas-microsoft-com:office:office" xmlns:v="urn:schemas-microsoft-com:vml" xmlns:w10="urn:schemas-microsoft-com:office:word" xmlns:w="http://schemas.openxmlformats.org/wordprocessingml/2006/main" xmlns:ma14="http://schemas.microsoft.com/office/mac/drawingml/2011/main" xmlns=""/>
-                        </a:ext>
-                      </a:extLst>
-                    </wps:spPr>
-                    <wps:style>
-                      <a:lnRef idx="0">
-                        <a:schemeClr val="accent1"/>
-                      </a:lnRef>
-                      <a:fillRef idx="0">
-                        <a:schemeClr val="accent1"/>
-                      </a:fillRef>
-                      <a:effectRef idx="0">
-                        <a:schemeClr val="accent1"/>
-                      </a:effectRef>
-                      <a:fontRef idx="minor">
-                        <a:schemeClr val="dk1"/>
-                      </a:fontRef>
-                    </wps:style>
-                    <wps:txbx>
-                      <w:txbxContent>
-                        <w:p>
-                          <w:pPr>
-                            <w:ind w:left="-142"/>
-                            <w:rPr>
-                              <w:rFonts w:ascii="Arial Narrow" w:eastAsiaTheme="minorEastAsia" w:hAnsi="Arial Narrow" w:cs="Univers-Condensed"/>
-                              <w:b/>
-                              <w:color w:val="36B8AC"/>
-                              <w:spacing w:val="-3"/>
-                              <w:sz w:val="16"/>
-                              <w:szCs w:val="16"/>
-                              <w:lang w:val="fr-CH" w:eastAsia="fr-FR"/>
-                            </w:rPr>
-                          </w:pPr>
-                          <w:r>
-                            <w:rPr>
-                              <w:rFonts w:ascii="Arial Narrow" w:eastAsiaTheme="minorEastAsia" w:hAnsi="Arial Narrow" w:cs="Univers-Condensed"/>
-                              <w:b/>
-                              <w:color w:val="36B8AC"/>
-                              <w:spacing w:val="-3"/>
-                              <w:sz w:val="16"/>
-                              <w:szCs w:val="16"/>
-                              <w:lang w:val="fr-CH" w:eastAsia="fr-FR"/>
-                            </w:rPr>
-                            <w:t>Laboratoire de virologie</w:t>
-                          </w:r>
-                          <w:r>
-                            <w:rPr>
-                              <w:rFonts w:ascii="Arial Narrow" w:eastAsiaTheme="minorEastAsia" w:hAnsi="Arial Narrow" w:cs="Univers-Condensed"/>
-                              <w:b/>
-                              <w:color w:val="36B8AC"/>
-                              <w:spacing w:val="-3"/>
-                              <w:sz w:val="16"/>
-                              <w:szCs w:val="16"/>
-                              <w:lang w:val="fr-CH" w:eastAsia="fr-FR"/>
-                            </w:rPr>
-                            <w:br/>
-                          </w:r>
-                          <w:r>
-                            <w:rPr>
-                              <w:rFonts w:ascii="Arial Narrow" w:eastAsiaTheme="minorEastAsia" w:hAnsi="Arial Narrow" w:cs="Arial"/>
-                              <w:color w:val="595959" w:themeColor="text1" w:themeTint="A6"/>
-                              <w:sz w:val="16"/>
-                              <w:szCs w:val="16"/>
-                              <w:lang w:val="fr-FR" w:eastAsia="fr-FR"/>
-                            </w:rPr>
-                            <w:t>Rue Gabrielle-Perret-Gentil 4</w:t>
-                          </w:r>
-                          <w:r>
-                            <w:rPr>
-                              <w:rFonts w:ascii="Arial Narrow" w:eastAsiaTheme="minorEastAsia" w:hAnsi="Arial Narrow" w:cs="Arial"/>
-                              <w:color w:val="595959" w:themeColor="text1" w:themeTint="A6"/>
-                              <w:sz w:val="16"/>
-                              <w:szCs w:val="16"/>
-                              <w:lang w:val="fr-FR" w:eastAsia="fr-FR"/>
-                            </w:rPr>
-                            <w:br/>
-                          </w:r>
-                          <w:r>
-                            <w:rPr>
-                              <w:rFonts w:ascii="Arial Narrow" w:eastAsiaTheme="minorEastAsia" w:hAnsi="Arial Narrow" w:cs="Arial"/>
-                              <w:color w:val="595959" w:themeColor="text1" w:themeTint="A6"/>
-                              <w:sz w:val="16"/>
-                              <w:szCs w:val="16"/>
-                              <w:lang w:val="fr-FR" w:eastAsia="fr-FR"/>
-                            </w:rPr>
-                            <w:t>CH – 1211 Genève 14</w:t>
-                          </w:r>
-                        </w:p>
-                      </w:txbxContent>
-                    </wps:txbx>
-                    <wps:bodyPr rot="0" spcFirstLastPara="0" vertOverflow="overflow" horzOverflow="overflow" vert="horz" wrap="square" lIns="91440" tIns="45720" rIns="91440" bIns="45720" numCol="1" spcCol="0" rtlCol="0" fromWordArt="0" anchor="t" anchorCtr="0" forceAA="0" compatLnSpc="1">
-                      <a:prstTxWarp prst="textNoShape">
-                        <a:avLst/>
-                      </a:prstTxWarp>
-                      <a:noAutofit/>
-                    </wps:bodyPr>
-                  </wps:wsp>
-                </a:graphicData>
-              </a:graphic>
-              <wp14:sizeRelH relativeFrom="margin">
-                <wp14:pctWidth>0</wp14:pctWidth>
-              </wp14:sizeRelH>
-              <wp14:sizeRelV relativeFrom="margin">
-                <wp14:pctHeight>0</wp14:pctHeight>
-              </wp14:sizeRelV>
-            </wp:anchor>
-          </w:drawing>
-        </mc:Choice>
-        <mc:Fallback>
-          <w:pict>
-            <v:shapetype w14:anchorId="283AC564" id="_x0000_t202" coordsize="21600,21600" o:spt="202" path="m,l,21600r21600,l21600,xe">
-              <v:stroke joinstyle="miter"/>
-              <v:path gradientshapeok="t" o:connecttype="rect"/>
-            </v:shapetype>
-            <v:shape id="Zone de texte 25" o:spid="_x0000_s1026" type="#_x0000_t202" style="position:absolute;margin-left:6.25pt;margin-top:108.8pt;width:93.5pt;height:37.7pt;z-index:251659264;visibility:visible;mso-wrap-style:square;mso-width-percent:0;mso-height-percent:0;mso-wrap-distance-left:9pt;mso-wrap-distance-top:0;mso-wrap-distance-right:9pt;mso-wrap-distance-bottom:0;mso-position-horizontal:absolute;mso-position-horizontal-relative:text;mso-position-vertical:absolute;mso-position-vertical-relative:page;mso-width-percent:0;mso-height-percent:0;mso-width-relative:margin;mso-height-relative:margin;v-text-anchor:top" o:gfxdata="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" filled="f" stroked="f">
-              <v:textbox>
-                <w:txbxContent>
-                  <w:p>
-                    <w:pPr>
-                      <w:ind w:left="-142"/>
-                      <w:rPr>
-                        <w:rFonts w:ascii="Arial Narrow" w:eastAsiaTheme="minorEastAsia" w:hAnsi="Arial Narrow" w:cs="Univers-Condensed"/>
-                        <w:b/>
-                        <w:color w:val="36B8AC"/>
-                        <w:spacing w:val="-3"/>
-                        <w:sz w:val="16"/>
-                        <w:szCs w:val="16"/>
-                        <w:lang w:val="fr-CH" w:eastAsia="fr-FR"/>
-                      </w:rPr>
-                    </w:pPr>
-                    <w:r>
-                      <w:rPr>
-                        <w:rFonts w:ascii="Arial Narrow" w:eastAsiaTheme="minorEastAsia" w:hAnsi="Arial Narrow" w:cs="Univers-Condensed"/>
-                        <w:b/>
-                        <w:color w:val="36B8AC"/>
-                        <w:spacing w:val="-3"/>
-                        <w:sz w:val="16"/>
-                        <w:szCs w:val="16"/>
-                        <w:lang w:val="fr-CH" w:eastAsia="fr-FR"/>
-                      </w:rPr>
-                      <w:t>Laboratoire de virologie</w:t>
-                    </w:r>
-                    <w:r>
-                      <w:rPr>
-                        <w:rFonts w:ascii="Arial Narrow" w:eastAsiaTheme="minorEastAsia" w:hAnsi="Arial Narrow" w:cs="Univers-Condensed"/>
-                        <w:b/>
-                        <w:color w:val="36B8AC"/>
-                        <w:spacing w:val="-3"/>
-                        <w:sz w:val="16"/>
-                        <w:szCs w:val="16"/>
-                        <w:lang w:val="fr-CH" w:eastAsia="fr-FR"/>
-                      </w:rPr>
-                      <w:br/>
-                    </w:r>
-                    <w:r>
-                      <w:rPr>
-                        <w:rFonts w:ascii="Arial Narrow" w:eastAsiaTheme="minorEastAsia" w:hAnsi="Arial Narrow" w:cs="Arial"/>
-                        <w:color w:val="595959" w:themeColor="text1" w:themeTint="A6"/>
-                        <w:sz w:val="16"/>
-                        <w:szCs w:val="16"/>
-                        <w:lang w:val="fr-FR" w:eastAsia="fr-FR"/>
-                      </w:rPr>
-                      <w:t>Rue Gabrielle-Perret-Gentil 4</w:t>
-                    </w:r>
-                    <w:r>
-                      <w:rPr>
-                        <w:rFonts w:ascii="Arial Narrow" w:eastAsiaTheme="minorEastAsia" w:hAnsi="Arial Narrow" w:cs="Arial"/>
-                        <w:color w:val="595959" w:themeColor="text1" w:themeTint="A6"/>
-                        <w:sz w:val="16"/>
-                        <w:szCs w:val="16"/>
-                        <w:lang w:val="fr-FR" w:eastAsia="fr-FR"/>
-                      </w:rPr>
-                      <w:br/>
-                    </w:r>
-                    <w:r>
-                      <w:rPr>
-                        <w:rFonts w:ascii="Arial Narrow" w:eastAsiaTheme="minorEastAsia" w:hAnsi="Arial Narrow" w:cs="Arial"/>
-                        <w:color w:val="595959" w:themeColor="text1" w:themeTint="A6"/>
-                        <w:sz w:val="16"/>
-                        <w:szCs w:val="16"/>
-                        <w:lang w:val="fr-FR" w:eastAsia="fr-FR"/>
-                      </w:rPr>
-                      <w:t>CH – 1211 Genève 14</w:t>
-                    </w:r>
-                  </w:p>
-                </w:txbxContent>
-              </v:textbox>
-              <w10:wrap anchory="page"/>
-              <w10:anchorlock/>
-            </v:shape>
-          </w:pict>
-        </mc:Fallback>
-      </mc:AlternateContent>
-    </w:r>
-    <w:r>
-      <w:rPr>
-        <w:noProof/>
-      </w:rPr>
-      <w:drawing>
-        <wp:inline distT="0" distB="0" distL="0" distR="0" wp14:anchorId="404BA24C" wp14:editId="2DD0DC61">
-          <wp:extent cx="3140873" cy="1114816"/>
-          <wp:effectExtent l="0" t="0" r="0" b="3175"/>
-          <wp:docPr id="1" name="Picture" descr="Une image contenant texte, Police, logo, Graphique&#10;&#10;Description générée automatiquement"/>
-          <wp:cNvGraphicFramePr/>
-          <a:graphic xmlns:a="http://schemas.openxmlformats.org/drawingml/2006/main">
-            <a:graphicData uri="http://schemas.openxmlformats.org/drawingml/2006/picture">
-              <pic:pic xmlns:pic="http://schemas.openxmlformats.org/drawingml/2006/picture">
-                <pic:nvPicPr>
-                  <pic:cNvPr id="1" name="Picture" descr="Une image contenant texte, Police, logo, Graphique&#10;&#10;Description générée automatiquement"/>
-                  <pic:cNvPicPr>
-                    <a:picLocks noChangeAspect="1" noChangeArrowheads="1"/>
-                  </pic:cNvPicPr>
-                </pic:nvPicPr>
-                <pic:blipFill>
-                  <a:blip r:embed="rId1"/>
-                  <a:stretch>
-                    <a:fillRect/>
-                  </a:stretch>
-                </pic:blipFill>
-                <pic:spPr bwMode="auto">
-                  <a:xfrm>
-                    <a:off x="0" y="0"/>
-                    <a:ext cx="3362310" cy="1193413"/>
-                  </a:xfrm>
-                  <a:prstGeom prst="rect">
-                    <a:avLst/>
-                  </a:prstGeom>
-                  <a:noFill/>
-                  <a:ln w="9525">
-                    <a:noFill/>
-                    <a:headEnd/>
-                    <a:tailEnd/>
-                  </a:ln>
-                </pic:spPr>
-              </pic:pic>
-            </a:graphicData>
-          </a:graphic>
-        </wp:inline>
-      </w:drawing>
+      <w:rPr/>
     </w:r>
   </w:p>
   <w:p>
     <w:pPr>
-      <w:pStyle w:val="En-tte"/>
-    </w:pPr>
+      <w:pStyle w:val="Entte"/>
+      <w:rPr/>
+    </w:pPr>
+    <w:r>
+      <w:rPr/>
+    </w:r>
   </w:p>
 </w:hdr>
 </file>
 
 <file path=word/header3.xml><?xml version="1.0" encoding="utf-8"?>
-<w:hdr xmlns:wpc="http://schemas.microsoft.com/office/word/2010/wordprocessingCanvas" xmlns:cx="http://schemas.microsoft.com/office/drawing/2014/chartex" xmlns:cx1="http://schemas.microsoft.com/office/drawing/2015/9/8/chartex" xmlns:cx2="http://schemas.microsoft.com/office/drawing/2015/10/21/chartex" xmlns:cx3="http://schemas.microsoft.com/office/drawing/2016/5/9/chartex" xmlns:cx4="http://schemas.microsoft.com/office/drawing/2016/5/10/chartex" xmlns:cx5="http://schemas.microsoft.com/office/drawing/2016/5/11/chartex" xmlns:cx6="http://schemas.microsoft.com/office/drawing/2016/5/12/chartex" xmlns:cx7="http://schemas.microsoft.com/office/drawing/2016/5/13/chartex" xmlns:cx8="http://schemas.microsoft.com/office/drawing/2016/5/14/chartex" xmlns:mc="http://schemas.openxmlformats.org/markup-compatibility/2006" xmlns:aink="http://schemas.microsoft.com/office/drawing/2016/ink" xmlns:am3d="http://schemas.microsoft.com/office/drawing/2017/model3d" xmlns:o="urn:schemas-microsoft-com:office:office" xmlns:oel="http://schemas.microsoft.com/office/2019/extlst" xmlns:r="http://schemas.openxmlformats.org/officeDocument/2006/relationships" xmlns:m="http://schemas.openxmlformats.org/officeDocument/2006/math" xmlns:v="urn:schemas-microsoft-com:vml" xmlns:wp14="http://schemas.microsoft.com/office/word/2010/wordprocessingDrawing" xmlns:wp="http://schemas.openxmlformats.org/drawingml/2006/wordprocessingDrawing" xmlns:w10="urn:schemas-microsoft-com:office:word" xmlns:w="http://schemas.openxmlformats.org/wordprocessingml/2006/main" xmlns:w14="http://schemas.microsoft.com/office/word/2010/wordml" xmlns:w15="http://schemas.microsoft.com/office/word/2012/wordml" xmlns:w16cex="http://schemas.microsoft.com/office/word/2018/wordml/cex" xmlns:w16cid="http://schemas.microsoft.com/office/word/2016/wordml/cid" xmlns:w16="http://schemas.microsoft.com/office/word/2018/wordml" xmlns:w16du="http://schemas.microsoft.com/office/word/2023/wordml/word16du" xmlns:w16sdtdh="http://schemas.microsoft.com/office/word/2020/wordml/sdtdatahash" xmlns:w16se="http://schemas.microsoft.com/office/word/2015/wordml/symex" xmlns:wpg="http://schemas.microsoft.com/office/word/2010/wordprocessingGroup" xmlns:wpi="http://schemas.microsoft.com/office/word/2010/wordprocessingInk" xmlns:wne="http://schemas.microsoft.com/office/word/2006/wordml" xmlns:wps="http://schemas.microsoft.com/office/word/2010/wordprocessingShape" mc:Ignorable="w14 w15 w16se w16cid w16 w16cex w16sdtdh w16du wp14">
+<w:hdr xmlns:o="urn:schemas-microsoft-com:office:office" xmlns:r="http://schemas.openxmlformats.org/officeDocument/2006/relationships" xmlns:v="urn:schemas-microsoft-com:vml" xmlns:w="http://schemas.openxmlformats.org/wordprocessingml/2006/main" xmlns:w10="urn:schemas-microsoft-com:office:word" xmlns:wp="http://schemas.openxmlformats.org/drawingml/2006/wordprocessingDrawing" xmlns:wps="http://schemas.microsoft.com/office/word/2010/wordprocessingShape" xmlns:wpg="http://schemas.microsoft.com/office/word/2010/wordprocessingGroup" xmlns:mc="http://schemas.openxmlformats.org/markup-compatibility/2006" xmlns:wp14="http://schemas.microsoft.com/office/word/2010/wordprocessingDrawing" xmlns:w14="http://schemas.microsoft.com/office/word/2010/wordml" xmlns:w15="http://schemas.microsoft.com/office/word/2012/wordml" mc:Ignorable="w14 wp14 w15">
   <w:p>
     <w:pPr>
-      <w:pStyle w:val="En-tte"/>
-    </w:pPr>
+      <w:pStyle w:val="Entte"/>
+      <w:rPr/>
+    </w:pPr>
+    <w:r>
+      <w:rPr/>
+    </w:r>
+  </w:p>
+  <w:p>
+    <w:pPr>
+      <w:pStyle w:val="Entte"/>
+      <w:rPr/>
+    </w:pPr>
+    <w:r>
+      <w:rPr/>
+    </w:r>
   </w:p>
 </w:hdr>
 </file>
 
 <file path=word/styles.xml><?xml version="1.0" encoding="utf-8"?>
-<w:styles xmlns:mc="http://schemas.openxmlformats.org/markup-compatibility/2006" xmlns:r="http://schemas.openxmlformats.org/officeDocument/2006/relationships" xmlns:w="http://schemas.openxmlformats.org/wordprocessingml/2006/main" xmlns:w14="http://schemas.microsoft.com/office/word/2010/wordml" xmlns:w15="http://schemas.microsoft.com/office/word/2012/wordml" xmlns:w16cex="http://schemas.microsoft.com/office/word/2018/wordml/cex" xmlns:w16cid="http://schemas.microsoft.com/office/word/2016/wordml/cid" xmlns:w16="http://schemas.microsoft.com/office/word/2018/wordml" xmlns:w16du="http://schemas.microsoft.com/office/word/2023/wordml/word16du" xmlns:w16sdtdh="http://schemas.microsoft.com/office/word/2020/wordml/sdtdatahash" xmlns:w16se="http://schemas.microsoft.com/office/word/2015/wordml/symex" mc:Ignorable="w14 w15 w16se w16cid w16 w16cex w16sdtdh w16du">
+<w:styles xmlns:w="http://schemas.openxmlformats.org/wordprocessingml/2006/main" xmlns:w14="http://schemas.microsoft.com/office/word/2010/wordml" xmlns:mc="http://schemas.openxmlformats.org/markup-compatibility/2006" mc:Ignorable="w14">
   <w:docDefaults>
     <w:rPrDefault>
       <w:rPr>
-        <w:rFonts w:asciiTheme="minorHAnsi" w:eastAsiaTheme="minorHAnsi" w:hAnsiTheme="minorHAnsi" w:cstheme="minorBidi"/>
+        <w:rFonts w:ascii="Aptos" w:hAnsi="Aptos" w:eastAsia="Aptos" w:cs="" w:asciiTheme="minorHAnsi" w:cstheme="minorBidi" w:eastAsiaTheme="minorHAnsi" w:hAnsiTheme="minorHAnsi"/>
         <w:kern w:val="2"/>
         <w:sz w:val="24"/>
         <w:szCs w:val="24"/>
@@ -1087,21 +816,21 @@
     </w:rPrDefault>
     <w:pPrDefault>
       <w:pPr>
-        <w:spacing w:after="160" w:line="278" w:lineRule="auto"/>
+        <w:suppressAutoHyphens w:val="true"/>
       </w:pPr>
     </w:pPrDefault>
   </w:docDefaults>
   <w:latentStyles w:defLockedState="0" w:defUIPriority="99" w:defSemiHidden="0" w:defUnhideWhenUsed="0" w:defQFormat="0" w:count="376">
     <w:lsdException w:name="Normal" w:uiPriority="0" w:qFormat="1"/>
     <w:lsdException w:name="heading 1" w:uiPriority="9" w:qFormat="1"/>
-    <w:lsdException w:name="heading 2" w:semiHidden="1" w:uiPriority="9" w:unhideWhenUsed="1" w:qFormat="1"/>
-    <w:lsdException w:name="heading 3" w:semiHidden="1" w:uiPriority="9" w:unhideWhenUsed="1" w:qFormat="1"/>
-    <w:lsdException w:name="heading 4" w:semiHidden="1" w:uiPriority="9" w:unhideWhenUsed="1" w:qFormat="1"/>
-    <w:lsdException w:name="heading 5" w:semiHidden="1" w:uiPriority="9" w:unhideWhenUsed="1" w:qFormat="1"/>
-    <w:lsdException w:name="heading 6" w:semiHidden="1" w:uiPriority="9" w:unhideWhenUsed="1" w:qFormat="1"/>
-    <w:lsdException w:name="heading 7" w:semiHidden="1" w:uiPriority="9" w:unhideWhenUsed="1" w:qFormat="1"/>
-    <w:lsdException w:name="heading 8" w:semiHidden="1" w:uiPriority="9" w:unhideWhenUsed="1" w:qFormat="1"/>
-    <w:lsdException w:name="heading 9" w:semiHidden="1" w:uiPriority="9" w:unhideWhenUsed="1" w:qFormat="1"/>
+    <w:lsdException w:name="heading 2" w:uiPriority="9" w:semiHidden="1" w:unhideWhenUsed="1" w:qFormat="1"/>
+    <w:lsdException w:name="heading 3" w:uiPriority="9" w:semiHidden="1" w:unhideWhenUsed="1" w:qFormat="1"/>
+    <w:lsdException w:name="heading 4" w:uiPriority="9" w:semiHidden="1" w:unhideWhenUsed="1" w:qFormat="1"/>
+    <w:lsdException w:name="heading 5" w:uiPriority="9" w:semiHidden="1" w:unhideWhenUsed="1" w:qFormat="1"/>
+    <w:lsdException w:name="heading 6" w:uiPriority="9" w:semiHidden="1" w:unhideWhenUsed="1" w:qFormat="1"/>
+    <w:lsdException w:name="heading 7" w:uiPriority="9" w:semiHidden="1" w:unhideWhenUsed="1" w:qFormat="1"/>
+    <w:lsdException w:name="heading 8" w:uiPriority="9" w:semiHidden="1" w:unhideWhenUsed="1" w:qFormat="1"/>
+    <w:lsdException w:name="heading 9" w:uiPriority="9" w:semiHidden="1" w:unhideWhenUsed="1" w:qFormat="1"/>
     <w:lsdException w:name="index 1" w:semiHidden="1" w:unhideWhenUsed="1"/>
     <w:lsdException w:name="index 2" w:semiHidden="1" w:unhideWhenUsed="1"/>
     <w:lsdException w:name="index 3" w:semiHidden="1" w:unhideWhenUsed="1"/>
@@ -1111,22 +840,22 @@
     <w:lsdException w:name="index 7" w:semiHidden="1" w:unhideWhenUsed="1"/>
     <w:lsdException w:name="index 8" w:semiHidden="1" w:unhideWhenUsed="1"/>
     <w:lsdException w:name="index 9" w:semiHidden="1" w:unhideWhenUsed="1"/>
-    <w:lsdException w:name="toc 1" w:semiHidden="1" w:uiPriority="39" w:unhideWhenUsed="1"/>
-    <w:lsdException w:name="toc 2" w:semiHidden="1" w:uiPriority="39" w:unhideWhenUsed="1"/>
-    <w:lsdException w:name="toc 3" w:semiHidden="1" w:uiPriority="39" w:unhideWhenUsed="1"/>
-    <w:lsdException w:name="toc 4" w:semiHidden="1" w:uiPriority="39" w:unhideWhenUsed="1"/>
-    <w:lsdException w:name="toc 5" w:semiHidden="1" w:uiPriority="39" w:unhideWhenUsed="1"/>
-    <w:lsdException w:name="toc 6" w:semiHidden="1" w:uiPriority="39" w:unhideWhenUsed="1"/>
-    <w:lsdException w:name="toc 7" w:semiHidden="1" w:uiPriority="39" w:unhideWhenUsed="1"/>
-    <w:lsdException w:name="toc 8" w:semiHidden="1" w:uiPriority="39" w:unhideWhenUsed="1"/>
-    <w:lsdException w:name="toc 9" w:semiHidden="1" w:uiPriority="39" w:unhideWhenUsed="1"/>
+    <w:lsdException w:name="toc 1" w:uiPriority="39" w:semiHidden="1" w:unhideWhenUsed="1"/>
+    <w:lsdException w:name="toc 2" w:uiPriority="39" w:semiHidden="1" w:unhideWhenUsed="1"/>
+    <w:lsdException w:name="toc 3" w:uiPriority="39" w:semiHidden="1" w:unhideWhenUsed="1"/>
+    <w:lsdException w:name="toc 4" w:uiPriority="39" w:semiHidden="1" w:unhideWhenUsed="1"/>
+    <w:lsdException w:name="toc 5" w:uiPriority="39" w:semiHidden="1" w:unhideWhenUsed="1"/>
+    <w:lsdException w:name="toc 6" w:uiPriority="39" w:semiHidden="1" w:unhideWhenUsed="1"/>
+    <w:lsdException w:name="toc 7" w:uiPriority="39" w:semiHidden="1" w:unhideWhenUsed="1"/>
+    <w:lsdException w:name="toc 8" w:uiPriority="39" w:semiHidden="1" w:unhideWhenUsed="1"/>
+    <w:lsdException w:name="toc 9" w:uiPriority="39" w:semiHidden="1" w:unhideWhenUsed="1"/>
     <w:lsdException w:name="Normal Indent" w:semiHidden="1" w:unhideWhenUsed="1"/>
     <w:lsdException w:name="footnote text" w:semiHidden="1" w:unhideWhenUsed="1"/>
     <w:lsdException w:name="annotation text" w:semiHidden="1" w:unhideWhenUsed="1"/>
     <w:lsdException w:name="header" w:semiHidden="1" w:unhideWhenUsed="1"/>
     <w:lsdException w:name="footer" w:semiHidden="1" w:unhideWhenUsed="1"/>
     <w:lsdException w:name="index heading" w:semiHidden="1" w:unhideWhenUsed="1"/>
-    <w:lsdException w:name="caption" w:semiHidden="1" w:uiPriority="35" w:unhideWhenUsed="1" w:qFormat="1"/>
+    <w:lsdException w:name="caption" w:uiPriority="35" w:semiHidden="1" w:unhideWhenUsed="1" w:qFormat="1"/>
     <w:lsdException w:name="table of figures" w:semiHidden="1" w:unhideWhenUsed="1"/>
     <w:lsdException w:name="envelope address" w:semiHidden="1" w:unhideWhenUsed="1"/>
     <w:lsdException w:name="envelope return" w:semiHidden="1" w:unhideWhenUsed="1"/>
@@ -1157,7 +886,7 @@
     <w:lsdException w:name="Title" w:uiPriority="10" w:qFormat="1"/>
     <w:lsdException w:name="Closing" w:semiHidden="1" w:unhideWhenUsed="1"/>
     <w:lsdException w:name="Signature" w:semiHidden="1" w:unhideWhenUsed="1"/>
-    <w:lsdException w:name="Default Paragraph Font" w:semiHidden="1" w:uiPriority="1" w:unhideWhenUsed="1"/>
+    <w:lsdException w:name="Default Paragraph Font" w:uiPriority="1" w:semiHidden="1" w:unhideWhenUsed="1"/>
     <w:lsdException w:name="Body Text" w:semiHidden="1" w:unhideWhenUsed="1"/>
     <w:lsdException w:name="Body Text Indent" w:semiHidden="1" w:unhideWhenUsed="1"/>
     <w:lsdException w:name="List Continue" w:semiHidden="1" w:unhideWhenUsed="1"/>
@@ -1357,8 +1086,8 @@
     <w:lsdException w:name="Subtle Reference" w:uiPriority="31" w:qFormat="1"/>
     <w:lsdException w:name="Intense Reference" w:uiPriority="32" w:qFormat="1"/>
     <w:lsdException w:name="Book Title" w:uiPriority="33" w:qFormat="1"/>
-    <w:lsdException w:name="Bibliography" w:semiHidden="1" w:uiPriority="37" w:unhideWhenUsed="1"/>
-    <w:lsdException w:name="TOC Heading" w:semiHidden="1" w:uiPriority="39" w:unhideWhenUsed="1" w:qFormat="1"/>
+    <w:lsdException w:name="Bibliography" w:uiPriority="37" w:semiHidden="1" w:unhideWhenUsed="1"/>
+    <w:lsdException w:name="TOC Heading" w:uiPriority="39" w:semiHidden="1" w:unhideWhenUsed="1" w:qFormat="1"/>
     <w:lsdException w:name="Plain Table 1" w:uiPriority="41"/>
     <w:lsdException w:name="Plain Table 2" w:uiPriority="42"/>
     <w:lsdException w:name="Plain Table 3" w:uiPriority="43"/>
@@ -1469,38 +1198,44 @@
     <w:lsdException w:name="Unresolved Mention" w:semiHidden="1" w:unhideWhenUsed="1"/>
     <w:lsdException w:name="Smart Link" w:semiHidden="1" w:unhideWhenUsed="1"/>
   </w:latentStyles>
-  <w:style w:type="paragraph" w:default="1" w:styleId="Normal">
+  <w:style w:type="paragraph" w:styleId="Normal" w:default="1">
     <w:name w:val="Normal"/>
     <w:qFormat/>
-    <w:rsid w:val="00E25EA5"/>
-    <w:pPr>
+    <w:rsid w:val="00e25ea5"/>
+    <w:pPr>
+      <w:widowControl/>
+      <w:suppressAutoHyphens w:val="true"/>
+      <w:bidi w:val="0"/>
+      <w:spacing w:lineRule="auto" w:line="276" w:before="0" w:after="160"/>
+      <w:jc w:val="left"/>
       <w:outlineLvl w:val="1"/>
     </w:pPr>
     <w:rPr>
-      <w:rFonts w:ascii="Times New Roman" w:hAnsi="Times New Roman" w:cs="Times New Roman"/>
+      <w:rFonts w:ascii="Times New Roman" w:hAnsi="Times New Roman" w:eastAsia="Aptos" w:cs="Times New Roman"/>
       <w:color w:val="000000" w:themeColor="text1"/>
+      <w:kern w:val="2"/>
       <w:sz w:val="20"/>
       <w:szCs w:val="20"/>
-      <w:lang w:val="en-US"/>
+      <w:lang w:val="en-US" w:eastAsia="en-US" w:bidi="ar-SA"/>
     </w:rPr>
   </w:style>
   <w:style w:type="paragraph" w:styleId="Titre1">
-    <w:name w:val="heading 1"/>
+    <w:name w:val="Heading 1"/>
     <w:basedOn w:val="Normal"/>
     <w:next w:val="Normal"/>
     <w:link w:val="Titre1Car"/>
     <w:uiPriority w:val="9"/>
     <w:qFormat/>
-    <w:rsid w:val="00244A41"/>
-    <w:pPr>
-      <w:keepNext/>
+    <w:rsid w:val="00244a41"/>
+    <w:pPr>
+      <w:keepNext w:val="true"/>
       <w:keepLines/>
       <w:spacing w:before="360" w:after="80"/>
       <w:jc w:val="center"/>
       <w:outlineLvl w:val="0"/>
     </w:pPr>
     <w:rPr>
-      <w:rFonts w:eastAsiaTheme="majorEastAsia"/>
+      <w:rFonts w:eastAsia="" w:eastAsiaTheme="majorEastAsia"/>
       <w:b/>
       <w:bCs/>
       <w:sz w:val="28"/>
@@ -1508,16 +1243,16 @@
     </w:rPr>
   </w:style>
   <w:style w:type="paragraph" w:styleId="Titre2">
-    <w:name w:val="heading 2"/>
+    <w:name w:val="Heading 2"/>
     <w:basedOn w:val="Normal"/>
     <w:next w:val="Normal"/>
     <w:link w:val="Titre2Car"/>
     <w:uiPriority w:val="9"/>
     <w:unhideWhenUsed/>
     <w:qFormat/>
-    <w:rsid w:val="001C055C"/>
-    <w:pPr>
-      <w:spacing w:after="0"/>
+    <w:rsid w:val="001c055c"/>
+    <w:pPr>
+      <w:spacing w:before="0" w:after="0"/>
     </w:pPr>
     <w:rPr>
       <w:b/>
@@ -1527,7 +1262,7 @@
     </w:rPr>
   </w:style>
   <w:style w:type="paragraph" w:styleId="Titre3">
-    <w:name w:val="heading 3"/>
+    <w:name w:val="Heading 3"/>
     <w:basedOn w:val="Normal"/>
     <w:next w:val="Normal"/>
     <w:link w:val="Titre3Car"/>
@@ -1535,22 +1270,22 @@
     <w:semiHidden/>
     <w:unhideWhenUsed/>
     <w:qFormat/>
-    <w:rsid w:val="0090165C"/>
-    <w:pPr>
-      <w:keepNext/>
+    <w:rsid w:val="0090165c"/>
+    <w:pPr>
+      <w:keepNext w:val="true"/>
       <w:keepLines/>
       <w:spacing w:before="160" w:after="80"/>
       <w:outlineLvl w:val="2"/>
     </w:pPr>
     <w:rPr>
-      <w:rFonts w:eastAsiaTheme="majorEastAsia" w:cstheme="majorBidi"/>
-      <w:color w:val="0F4761" w:themeColor="accent1" w:themeShade="BF"/>
+      <w:rFonts w:eastAsia="" w:cs="" w:cstheme="majorBidi" w:eastAsiaTheme="majorEastAsia"/>
+      <w:color w:val="0F4761" w:themeColor="accent1" w:themeShade="bf"/>
       <w:sz w:val="28"/>
       <w:szCs w:val="28"/>
     </w:rPr>
   </w:style>
   <w:style w:type="paragraph" w:styleId="Titre4">
-    <w:name w:val="heading 4"/>
+    <w:name w:val="Heading 4"/>
     <w:basedOn w:val="Normal"/>
     <w:next w:val="Normal"/>
     <w:link w:val="Titre4Car"/>
@@ -1558,22 +1293,22 @@
     <w:semiHidden/>
     <w:unhideWhenUsed/>
     <w:qFormat/>
-    <w:rsid w:val="0090165C"/>
-    <w:pPr>
-      <w:keepNext/>
+    <w:rsid w:val="0090165c"/>
+    <w:pPr>
+      <w:keepNext w:val="true"/>
       <w:keepLines/>
       <w:spacing w:before="80" w:after="40"/>
       <w:outlineLvl w:val="3"/>
     </w:pPr>
     <w:rPr>
-      <w:rFonts w:eastAsiaTheme="majorEastAsia" w:cstheme="majorBidi"/>
+      <w:rFonts w:eastAsia="" w:cs="" w:cstheme="majorBidi" w:eastAsiaTheme="majorEastAsia"/>
       <w:i/>
       <w:iCs/>
-      <w:color w:val="0F4761" w:themeColor="accent1" w:themeShade="BF"/>
+      <w:color w:val="0F4761" w:themeColor="accent1" w:themeShade="bf"/>
     </w:rPr>
   </w:style>
   <w:style w:type="paragraph" w:styleId="Titre5">
-    <w:name w:val="heading 5"/>
+    <w:name w:val="Heading 5"/>
     <w:basedOn w:val="Normal"/>
     <w:next w:val="Normal"/>
     <w:link w:val="Titre5Car"/>
@@ -1581,20 +1316,20 @@
     <w:semiHidden/>
     <w:unhideWhenUsed/>
     <w:qFormat/>
-    <w:rsid w:val="0090165C"/>
-    <w:pPr>
-      <w:keepNext/>
+    <w:rsid w:val="0090165c"/>
+    <w:pPr>
+      <w:keepNext w:val="true"/>
       <w:keepLines/>
       <w:spacing w:before="80" w:after="40"/>
       <w:outlineLvl w:val="4"/>
     </w:pPr>
     <w:rPr>
-      <w:rFonts w:eastAsiaTheme="majorEastAsia" w:cstheme="majorBidi"/>
-      <w:color w:val="0F4761" w:themeColor="accent1" w:themeShade="BF"/>
+      <w:rFonts w:eastAsia="" w:cs="" w:cstheme="majorBidi" w:eastAsiaTheme="majorEastAsia"/>
+      <w:color w:val="0F4761" w:themeColor="accent1" w:themeShade="bf"/>
     </w:rPr>
   </w:style>
   <w:style w:type="paragraph" w:styleId="Titre6">
-    <w:name w:val="heading 6"/>
+    <w:name w:val="Heading 6"/>
     <w:basedOn w:val="Normal"/>
     <w:next w:val="Normal"/>
     <w:link w:val="Titre6Car"/>
@@ -1602,22 +1337,22 @@
     <w:semiHidden/>
     <w:unhideWhenUsed/>
     <w:qFormat/>
-    <w:rsid w:val="0090165C"/>
-    <w:pPr>
-      <w:keepNext/>
+    <w:rsid w:val="0090165c"/>
+    <w:pPr>
+      <w:keepNext w:val="true"/>
       <w:keepLines/>
       <w:spacing w:before="40" w:after="0"/>
       <w:outlineLvl w:val="5"/>
     </w:pPr>
     <w:rPr>
-      <w:rFonts w:eastAsiaTheme="majorEastAsia" w:cstheme="majorBidi"/>
+      <w:rFonts w:eastAsia="" w:cs="" w:cstheme="majorBidi" w:eastAsiaTheme="majorEastAsia"/>
       <w:i/>
       <w:iCs/>
-      <w:color w:val="595959" w:themeColor="text1" w:themeTint="A6"/>
+      <w:color w:val="595959" w:themeColor="text1" w:themeTint="a6"/>
     </w:rPr>
   </w:style>
   <w:style w:type="paragraph" w:styleId="Titre7">
-    <w:name w:val="heading 7"/>
+    <w:name w:val="Heading 7"/>
     <w:basedOn w:val="Normal"/>
     <w:next w:val="Normal"/>
     <w:link w:val="Titre7Car"/>
@@ -1625,20 +1360,20 @@
     <w:semiHidden/>
     <w:unhideWhenUsed/>
     <w:qFormat/>
-    <w:rsid w:val="0090165C"/>
-    <w:pPr>
-      <w:keepNext/>
+    <w:rsid w:val="0090165c"/>
+    <w:pPr>
+      <w:keepNext w:val="true"/>
       <w:keepLines/>
       <w:spacing w:before="40" w:after="0"/>
       <w:outlineLvl w:val="6"/>
     </w:pPr>
     <w:rPr>
-      <w:rFonts w:eastAsiaTheme="majorEastAsia" w:cstheme="majorBidi"/>
-      <w:color w:val="595959" w:themeColor="text1" w:themeTint="A6"/>
+      <w:rFonts w:eastAsia="" w:cs="" w:cstheme="majorBidi" w:eastAsiaTheme="majorEastAsia"/>
+      <w:color w:val="595959" w:themeColor="text1" w:themeTint="a6"/>
     </w:rPr>
   </w:style>
   <w:style w:type="paragraph" w:styleId="Titre8">
-    <w:name w:val="heading 8"/>
+    <w:name w:val="Heading 8"/>
     <w:basedOn w:val="Normal"/>
     <w:next w:val="Normal"/>
     <w:link w:val="Titre8Car"/>
@@ -1646,22 +1381,22 @@
     <w:semiHidden/>
     <w:unhideWhenUsed/>
     <w:qFormat/>
-    <w:rsid w:val="0090165C"/>
-    <w:pPr>
-      <w:keepNext/>
+    <w:rsid w:val="0090165c"/>
+    <w:pPr>
+      <w:keepNext w:val="true"/>
       <w:keepLines/>
-      <w:spacing w:after="0"/>
+      <w:spacing w:before="0" w:after="0"/>
       <w:outlineLvl w:val="7"/>
     </w:pPr>
     <w:rPr>
-      <w:rFonts w:eastAsiaTheme="majorEastAsia" w:cstheme="majorBidi"/>
+      <w:rFonts w:eastAsia="" w:cs="" w:cstheme="majorBidi" w:eastAsiaTheme="majorEastAsia"/>
       <w:i/>
       <w:iCs/>
-      <w:color w:val="272727" w:themeColor="text1" w:themeTint="D8"/>
+      <w:color w:val="272727" w:themeColor="text1" w:themeTint="d8"/>
     </w:rPr>
   </w:style>
   <w:style w:type="paragraph" w:styleId="Titre9">
-    <w:name w:val="heading 9"/>
+    <w:name w:val="Heading 9"/>
     <w:basedOn w:val="Normal"/>
     <w:next w:val="Normal"/>
     <w:link w:val="Titre9Car"/>
@@ -1669,23 +1404,531 @@
     <w:semiHidden/>
     <w:unhideWhenUsed/>
     <w:qFormat/>
-    <w:rsid w:val="0090165C"/>
-    <w:pPr>
-      <w:keepNext/>
+    <w:rsid w:val="0090165c"/>
+    <w:pPr>
+      <w:keepNext w:val="true"/>
       <w:keepLines/>
-      <w:spacing w:after="0"/>
+      <w:spacing w:before="0" w:after="0"/>
       <w:outlineLvl w:val="8"/>
     </w:pPr>
     <w:rPr>
-      <w:rFonts w:eastAsiaTheme="majorEastAsia" w:cstheme="majorBidi"/>
-      <w:color w:val="272727" w:themeColor="text1" w:themeTint="D8"/>
-    </w:rPr>
-  </w:style>
-  <w:style w:type="character" w:default="1" w:styleId="Policepardfaut">
+      <w:rFonts w:eastAsia="" w:cs="" w:cstheme="majorBidi" w:eastAsiaTheme="majorEastAsia"/>
+      <w:color w:val="272727" w:themeColor="text1" w:themeTint="d8"/>
+    </w:rPr>
+  </w:style>
+  <w:style w:type="character" w:styleId="DefaultParagraphFont" w:default="1">
     <w:name w:val="Default Paragraph Font"/>
     <w:uiPriority w:val="1"/>
     <w:semiHidden/>
     <w:unhideWhenUsed/>
+    <w:qFormat/>
+    <w:rPr/>
+  </w:style>
+  <w:style w:type="character" w:styleId="Titre1Car" w:customStyle="1">
+    <w:name w:val="Titre 1 Car"/>
+    <w:basedOn w:val="DefaultParagraphFont"/>
+    <w:uiPriority w:val="9"/>
+    <w:qFormat/>
+    <w:rsid w:val="00244a41"/>
+    <w:rPr>
+      <w:rFonts w:ascii="Times New Roman" w:hAnsi="Times New Roman" w:eastAsia="" w:cs="Times New Roman" w:eastAsiaTheme="majorEastAsia"/>
+      <w:b/>
+      <w:bCs/>
+      <w:color w:val="000000" w:themeColor="text1"/>
+      <w:sz w:val="28"/>
+      <w:szCs w:val="28"/>
+      <w:lang w:val="en-US"/>
+    </w:rPr>
+  </w:style>
+  <w:style w:type="character" w:styleId="Titre2Car" w:customStyle="1">
+    <w:name w:val="Titre 2 Car"/>
+    <w:basedOn w:val="DefaultParagraphFont"/>
+    <w:uiPriority w:val="9"/>
+    <w:qFormat/>
+    <w:rsid w:val="001c055c"/>
+    <w:rPr>
+      <w:rFonts w:ascii="Times New Roman" w:hAnsi="Times New Roman" w:cs="Times New Roman"/>
+      <w:b/>
+      <w:bCs/>
+      <w:color w:val="000000" w:themeColor="text1"/>
+      <w:sz w:val="22"/>
+      <w:szCs w:val="22"/>
+      <w:lang w:val="en-US"/>
+    </w:rPr>
+  </w:style>
+  <w:style w:type="character" w:styleId="Titre3Car" w:customStyle="1">
+    <w:name w:val="Titre 3 Car"/>
+    <w:basedOn w:val="DefaultParagraphFont"/>
+    <w:uiPriority w:val="9"/>
+    <w:semiHidden/>
+    <w:qFormat/>
+    <w:rsid w:val="0090165c"/>
+    <w:rPr>
+      <w:rFonts w:eastAsia="" w:cs="" w:cstheme="majorBidi" w:eastAsiaTheme="majorEastAsia"/>
+      <w:color w:val="0F4761" w:themeColor="accent1" w:themeShade="bf"/>
+      <w:sz w:val="28"/>
+      <w:szCs w:val="28"/>
+    </w:rPr>
+  </w:style>
+  <w:style w:type="character" w:styleId="Titre4Car" w:customStyle="1">
+    <w:name w:val="Titre 4 Car"/>
+    <w:basedOn w:val="DefaultParagraphFont"/>
+    <w:uiPriority w:val="9"/>
+    <w:semiHidden/>
+    <w:qFormat/>
+    <w:rsid w:val="0090165c"/>
+    <w:rPr>
+      <w:rFonts w:eastAsia="" w:cs="" w:cstheme="majorBidi" w:eastAsiaTheme="majorEastAsia"/>
+      <w:i/>
+      <w:iCs/>
+      <w:color w:val="0F4761" w:themeColor="accent1" w:themeShade="bf"/>
+    </w:rPr>
+  </w:style>
+  <w:style w:type="character" w:styleId="Titre5Car" w:customStyle="1">
+    <w:name w:val="Titre 5 Car"/>
+    <w:basedOn w:val="DefaultParagraphFont"/>
+    <w:uiPriority w:val="9"/>
+    <w:semiHidden/>
+    <w:qFormat/>
+    <w:rsid w:val="0090165c"/>
+    <w:rPr>
+      <w:rFonts w:eastAsia="" w:cs="" w:cstheme="majorBidi" w:eastAsiaTheme="majorEastAsia"/>
+      <w:color w:val="0F4761" w:themeColor="accent1" w:themeShade="bf"/>
+    </w:rPr>
+  </w:style>
+  <w:style w:type="character" w:styleId="Titre6Car" w:customStyle="1">
+    <w:name w:val="Titre 6 Car"/>
+    <w:basedOn w:val="DefaultParagraphFont"/>
+    <w:uiPriority w:val="9"/>
+    <w:semiHidden/>
+    <w:qFormat/>
+    <w:rsid w:val="0090165c"/>
+    <w:rPr>
+      <w:rFonts w:eastAsia="" w:cs="" w:cstheme="majorBidi" w:eastAsiaTheme="majorEastAsia"/>
+      <w:i/>
+      <w:iCs/>
+      <w:color w:val="595959" w:themeColor="text1" w:themeTint="a6"/>
+    </w:rPr>
+  </w:style>
+  <w:style w:type="character" w:styleId="Titre7Car" w:customStyle="1">
+    <w:name w:val="Titre 7 Car"/>
+    <w:basedOn w:val="DefaultParagraphFont"/>
+    <w:uiPriority w:val="9"/>
+    <w:semiHidden/>
+    <w:qFormat/>
+    <w:rsid w:val="0090165c"/>
+    <w:rPr>
+      <w:rFonts w:eastAsia="" w:cs="" w:cstheme="majorBidi" w:eastAsiaTheme="majorEastAsia"/>
+      <w:color w:val="595959" w:themeColor="text1" w:themeTint="a6"/>
+    </w:rPr>
+  </w:style>
+  <w:style w:type="character" w:styleId="Titre8Car" w:customStyle="1">
+    <w:name w:val="Titre 8 Car"/>
+    <w:basedOn w:val="DefaultParagraphFont"/>
+    <w:uiPriority w:val="9"/>
+    <w:semiHidden/>
+    <w:qFormat/>
+    <w:rsid w:val="0090165c"/>
+    <w:rPr>
+      <w:rFonts w:eastAsia="" w:cs="" w:cstheme="majorBidi" w:eastAsiaTheme="majorEastAsia"/>
+      <w:i/>
+      <w:iCs/>
+      <w:color w:val="272727" w:themeColor="text1" w:themeTint="d8"/>
+    </w:rPr>
+  </w:style>
+  <w:style w:type="character" w:styleId="Titre9Car" w:customStyle="1">
+    <w:name w:val="Titre 9 Car"/>
+    <w:basedOn w:val="DefaultParagraphFont"/>
+    <w:uiPriority w:val="9"/>
+    <w:semiHidden/>
+    <w:qFormat/>
+    <w:rsid w:val="0090165c"/>
+    <w:rPr>
+      <w:rFonts w:eastAsia="" w:cs="" w:cstheme="majorBidi" w:eastAsiaTheme="majorEastAsia"/>
+      <w:color w:val="272727" w:themeColor="text1" w:themeTint="d8"/>
+    </w:rPr>
+  </w:style>
+  <w:style w:type="character" w:styleId="TitreCar" w:customStyle="1">
+    <w:name w:val="Titre Car"/>
+    <w:basedOn w:val="DefaultParagraphFont"/>
+    <w:uiPriority w:val="10"/>
+    <w:qFormat/>
+    <w:rsid w:val="0090165c"/>
+    <w:rPr>
+      <w:rFonts w:ascii="Aptos Display" w:hAnsi="Aptos Display" w:eastAsia="" w:cs="" w:asciiTheme="majorHAnsi" w:cstheme="majorBidi" w:eastAsiaTheme="majorEastAsia" w:hAnsiTheme="majorHAnsi"/>
+      <w:spacing w:val="-10"/>
+      <w:kern w:val="2"/>
+      <w:sz w:val="56"/>
+      <w:szCs w:val="56"/>
+    </w:rPr>
+  </w:style>
+  <w:style w:type="character" w:styleId="SoustitreCar" w:customStyle="1">
+    <w:name w:val="Sous-titre Car"/>
+    <w:basedOn w:val="DefaultParagraphFont"/>
+    <w:uiPriority w:val="11"/>
+    <w:qFormat/>
+    <w:rsid w:val="0090165c"/>
+    <w:rPr>
+      <w:rFonts w:eastAsia="" w:cs="" w:cstheme="majorBidi" w:eastAsiaTheme="majorEastAsia"/>
+      <w:color w:val="595959" w:themeColor="text1" w:themeTint="a6"/>
+      <w:spacing w:val="15"/>
+      <w:sz w:val="28"/>
+      <w:szCs w:val="28"/>
+    </w:rPr>
+  </w:style>
+  <w:style w:type="character" w:styleId="CitationCar" w:customStyle="1">
+    <w:name w:val="Citation Car"/>
+    <w:basedOn w:val="DefaultParagraphFont"/>
+    <w:link w:val="Quote"/>
+    <w:uiPriority w:val="29"/>
+    <w:qFormat/>
+    <w:rsid w:val="0090165c"/>
+    <w:rPr>
+      <w:i/>
+      <w:iCs/>
+      <w:color w:val="404040" w:themeColor="text1" w:themeTint="bf"/>
+    </w:rPr>
+  </w:style>
+  <w:style w:type="character" w:styleId="IntenseEmphasis">
+    <w:name w:val="Intense Emphasis"/>
+    <w:basedOn w:val="DefaultParagraphFont"/>
+    <w:uiPriority w:val="21"/>
+    <w:qFormat/>
+    <w:rsid w:val="0090165c"/>
+    <w:rPr>
+      <w:i/>
+      <w:iCs/>
+      <w:color w:val="0F4761" w:themeColor="accent1" w:themeShade="bf"/>
+    </w:rPr>
+  </w:style>
+  <w:style w:type="character" w:styleId="CitationintenseCar" w:customStyle="1">
+    <w:name w:val="Citation intense Car"/>
+    <w:basedOn w:val="DefaultParagraphFont"/>
+    <w:link w:val="IntenseQuote"/>
+    <w:uiPriority w:val="30"/>
+    <w:qFormat/>
+    <w:rsid w:val="0090165c"/>
+    <w:rPr>
+      <w:i/>
+      <w:iCs/>
+      <w:color w:val="0F4761" w:themeColor="accent1" w:themeShade="bf"/>
+    </w:rPr>
+  </w:style>
+  <w:style w:type="character" w:styleId="IntenseReference">
+    <w:name w:val="Intense Reference"/>
+    <w:basedOn w:val="DefaultParagraphFont"/>
+    <w:uiPriority w:val="32"/>
+    <w:qFormat/>
+    <w:rsid w:val="0090165c"/>
+    <w:rPr>
+      <w:b/>
+      <w:bCs/>
+      <w:smallCaps/>
+      <w:color w:val="0F4761" w:themeColor="accent1" w:themeShade="bf"/>
+      <w:spacing w:val="5"/>
+    </w:rPr>
+  </w:style>
+  <w:style w:type="character" w:styleId="Strong">
+    <w:name w:val="Strong"/>
+    <w:basedOn w:val="DefaultParagraphFont"/>
+    <w:uiPriority w:val="22"/>
+    <w:qFormat/>
+    <w:rsid w:val="00ae6614"/>
+    <w:rPr>
+      <w:b/>
+      <w:bCs/>
+      <w:sz w:val="18"/>
+      <w:szCs w:val="18"/>
+    </w:rPr>
+  </w:style>
+  <w:style w:type="character" w:styleId="EntteCar" w:customStyle="1">
+    <w:name w:val="En-tête Car"/>
+    <w:basedOn w:val="DefaultParagraphFont"/>
+    <w:uiPriority w:val="99"/>
+    <w:qFormat/>
+    <w:rsid w:val="0048109f"/>
+    <w:rPr>
+      <w:rFonts w:ascii="Times New Roman" w:hAnsi="Times New Roman" w:cs="Times New Roman"/>
+      <w:color w:val="000000" w:themeColor="text1"/>
+      <w:sz w:val="20"/>
+      <w:szCs w:val="20"/>
+      <w:lang w:val="en-US"/>
+    </w:rPr>
+  </w:style>
+  <w:style w:type="character" w:styleId="PieddepageCar" w:customStyle="1">
+    <w:name w:val="Pied de page Car"/>
+    <w:basedOn w:val="DefaultParagraphFont"/>
+    <w:uiPriority w:val="99"/>
+    <w:qFormat/>
+    <w:rsid w:val="0048109f"/>
+    <w:rPr>
+      <w:rFonts w:ascii="Times New Roman" w:hAnsi="Times New Roman" w:cs="Times New Roman"/>
+      <w:color w:val="000000" w:themeColor="text1"/>
+      <w:sz w:val="20"/>
+      <w:szCs w:val="20"/>
+      <w:lang w:val="en-US"/>
+    </w:rPr>
+  </w:style>
+  <w:style w:type="character" w:styleId="NotedebasdepageCar" w:customStyle="1">
+    <w:name w:val="Note de bas de page Car"/>
+    <w:basedOn w:val="DefaultParagraphFont"/>
+    <w:uiPriority w:val="99"/>
+    <w:semiHidden/>
+    <w:qFormat/>
+    <w:rsid w:val="00164bde"/>
+    <w:rPr>
+      <w:rFonts w:ascii="Times New Roman" w:hAnsi="Times New Roman" w:cs="Times New Roman"/>
+      <w:color w:val="000000" w:themeColor="text1"/>
+      <w:sz w:val="20"/>
+      <w:szCs w:val="20"/>
+      <w:lang w:val="en-US"/>
+    </w:rPr>
+  </w:style>
+  <w:style w:type="character" w:styleId="Caractresdenotedebasdepage">
+    <w:name w:val="Caractères de note de bas de page"/>
+    <w:basedOn w:val="DefaultParagraphFont"/>
+    <w:uiPriority w:val="99"/>
+    <w:semiHidden/>
+    <w:unhideWhenUsed/>
+    <w:qFormat/>
+    <w:rsid w:val="00164bde"/>
+    <w:rPr>
+      <w:vertAlign w:val="superscript"/>
+    </w:rPr>
+  </w:style>
+  <w:style w:type="character" w:styleId="Ancredenotedebasdepage">
+    <w:name w:val="Ancre de note de bas de page"/>
+    <w:rPr>
+      <w:vertAlign w:val="superscript"/>
+    </w:rPr>
+  </w:style>
+  <w:style w:type="character" w:styleId="Ancredenotedefin">
+    <w:name w:val="Ancre de note de fin"/>
+    <w:rPr>
+      <w:vertAlign w:val="superscript"/>
+    </w:rPr>
+  </w:style>
+  <w:style w:type="character" w:styleId="Caractresdenotedefin">
+    <w:name w:val="Caractères de note de fin"/>
+    <w:qFormat/>
+    <w:rPr/>
+  </w:style>
+  <w:style w:type="paragraph" w:styleId="Titre">
+    <w:name w:val="Titre"/>
+    <w:basedOn w:val="Normal"/>
+    <w:next w:val="Corpsdetexte"/>
+    <w:qFormat/>
+    <w:pPr>
+      <w:keepNext w:val="true"/>
+      <w:spacing w:before="240" w:after="120"/>
+    </w:pPr>
+    <w:rPr>
+      <w:rFonts w:ascii="Liberation Sans" w:hAnsi="Liberation Sans" w:eastAsia="Noto Sans CJK SC" w:cs="Lohit Devanagari"/>
+      <w:sz w:val="28"/>
+      <w:szCs w:val="28"/>
+    </w:rPr>
+  </w:style>
+  <w:style w:type="paragraph" w:styleId="Corpsdetexte">
+    <w:name w:val="Body Text"/>
+    <w:basedOn w:val="Normal"/>
+    <w:pPr>
+      <w:spacing w:lineRule="auto" w:line="276" w:before="0" w:after="140"/>
+    </w:pPr>
+    <w:rPr/>
+  </w:style>
+  <w:style w:type="paragraph" w:styleId="Liste">
+    <w:name w:val="List"/>
+    <w:basedOn w:val="Corpsdetexte"/>
+    <w:pPr/>
+    <w:rPr>
+      <w:rFonts w:cs="Lohit Devanagari"/>
+    </w:rPr>
+  </w:style>
+  <w:style w:type="paragraph" w:styleId="Lgende">
+    <w:name w:val="Caption"/>
+    <w:basedOn w:val="Normal"/>
+    <w:qFormat/>
+    <w:pPr>
+      <w:suppressLineNumbers/>
+      <w:spacing w:before="120" w:after="120"/>
+    </w:pPr>
+    <w:rPr>
+      <w:rFonts w:cs="Lohit Devanagari"/>
+      <w:i/>
+      <w:iCs/>
+      <w:sz w:val="24"/>
+      <w:szCs w:val="24"/>
+    </w:rPr>
+  </w:style>
+  <w:style w:type="paragraph" w:styleId="Index">
+    <w:name w:val="Index"/>
+    <w:basedOn w:val="Normal"/>
+    <w:qFormat/>
+    <w:pPr>
+      <w:suppressLineNumbers/>
+    </w:pPr>
+    <w:rPr>
+      <w:rFonts w:cs="Lohit Devanagari"/>
+    </w:rPr>
+  </w:style>
+  <w:style w:type="paragraph" w:styleId="Titreprincipal">
+    <w:name w:val="Title"/>
+    <w:basedOn w:val="Normal"/>
+    <w:next w:val="Normal"/>
+    <w:link w:val="TitreCar"/>
+    <w:uiPriority w:val="10"/>
+    <w:qFormat/>
+    <w:rsid w:val="0090165c"/>
+    <w:pPr>
+      <w:spacing w:lineRule="auto" w:line="240" w:before="0" w:after="80"/>
+      <w:contextualSpacing/>
+    </w:pPr>
+    <w:rPr>
+      <w:rFonts w:ascii="Aptos Display" w:hAnsi="Aptos Display" w:eastAsia="" w:cs="" w:asciiTheme="majorHAnsi" w:cstheme="majorBidi" w:eastAsiaTheme="majorEastAsia" w:hAnsiTheme="majorHAnsi"/>
+      <w:spacing w:val="-10"/>
+      <w:kern w:val="2"/>
+      <w:sz w:val="56"/>
+      <w:szCs w:val="56"/>
+    </w:rPr>
+  </w:style>
+  <w:style w:type="paragraph" w:styleId="Soustitre">
+    <w:name w:val="Subtitle"/>
+    <w:basedOn w:val="Normal"/>
+    <w:next w:val="Normal"/>
+    <w:link w:val="SoustitreCar"/>
+    <w:uiPriority w:val="11"/>
+    <w:qFormat/>
+    <w:rsid w:val="0090165c"/>
+    <w:pPr/>
+    <w:rPr>
+      <w:rFonts w:eastAsia="" w:cs="" w:cstheme="majorBidi" w:eastAsiaTheme="majorEastAsia"/>
+      <w:color w:val="595959" w:themeColor="text1" w:themeTint="a6"/>
+      <w:spacing w:val="15"/>
+      <w:sz w:val="28"/>
+      <w:szCs w:val="28"/>
+    </w:rPr>
+  </w:style>
+  <w:style w:type="paragraph" w:styleId="Quote">
+    <w:name w:val="Quote"/>
+    <w:basedOn w:val="Normal"/>
+    <w:next w:val="Normal"/>
+    <w:link w:val="CitationCar"/>
+    <w:uiPriority w:val="29"/>
+    <w:qFormat/>
+    <w:rsid w:val="0090165c"/>
+    <w:pPr>
+      <w:spacing w:before="160" w:after="160"/>
+      <w:jc w:val="center"/>
+    </w:pPr>
+    <w:rPr>
+      <w:i/>
+      <w:iCs/>
+      <w:color w:val="404040" w:themeColor="text1" w:themeTint="bf"/>
+    </w:rPr>
+  </w:style>
+  <w:style w:type="paragraph" w:styleId="ListParagraph">
+    <w:name w:val="List Paragraph"/>
+    <w:basedOn w:val="Normal"/>
+    <w:uiPriority w:val="34"/>
+    <w:qFormat/>
+    <w:rsid w:val="0090165c"/>
+    <w:pPr>
+      <w:spacing w:before="0" w:after="160"/>
+      <w:ind w:left="720" w:hanging="0"/>
+      <w:contextualSpacing/>
+    </w:pPr>
+    <w:rPr/>
+  </w:style>
+  <w:style w:type="paragraph" w:styleId="IntenseQuote">
+    <w:name w:val="Intense Quote"/>
+    <w:basedOn w:val="Normal"/>
+    <w:next w:val="Normal"/>
+    <w:link w:val="CitationintenseCar"/>
+    <w:uiPriority w:val="30"/>
+    <w:qFormat/>
+    <w:rsid w:val="0090165c"/>
+    <w:pPr>
+      <w:pBdr>
+        <w:top w:val="single" w:sz="4" w:space="10" w:color="0F4761"/>
+        <w:bottom w:val="single" w:sz="4" w:space="10" w:color="0F4761"/>
+      </w:pBdr>
+      <w:spacing w:before="360" w:after="360"/>
+      <w:ind w:left="864" w:right="864" w:hanging="0"/>
+      <w:jc w:val="center"/>
+    </w:pPr>
+    <w:rPr>
+      <w:i/>
+      <w:iCs/>
+      <w:color w:val="0F4761" w:themeColor="accent1" w:themeShade="bf"/>
+    </w:rPr>
+  </w:style>
+  <w:style w:type="paragraph" w:styleId="Entteetpieddepage">
+    <w:name w:val="En-tête et pied de page"/>
+    <w:basedOn w:val="Normal"/>
+    <w:qFormat/>
+    <w:pPr/>
+    <w:rPr/>
+  </w:style>
+  <w:style w:type="paragraph" w:styleId="Entte">
+    <w:name w:val="Header"/>
+    <w:basedOn w:val="Normal"/>
+    <w:link w:val="EntteCar"/>
+    <w:uiPriority w:val="99"/>
+    <w:unhideWhenUsed/>
+    <w:rsid w:val="0048109f"/>
+    <w:pPr>
+      <w:tabs>
+        <w:tab w:val="clear" w:pos="708"/>
+        <w:tab w:val="center" w:pos="4536" w:leader="none"/>
+        <w:tab w:val="right" w:pos="9072" w:leader="none"/>
+      </w:tabs>
+      <w:spacing w:lineRule="auto" w:line="240" w:before="0" w:after="0"/>
+    </w:pPr>
+    <w:rPr/>
+  </w:style>
+  <w:style w:type="paragraph" w:styleId="Pieddepage">
+    <w:name w:val="Footer"/>
+    <w:basedOn w:val="Normal"/>
+    <w:link w:val="PieddepageCar"/>
+    <w:uiPriority w:val="99"/>
+    <w:unhideWhenUsed/>
+    <w:rsid w:val="0048109f"/>
+    <w:pPr>
+      <w:tabs>
+        <w:tab w:val="clear" w:pos="708"/>
+        <w:tab w:val="center" w:pos="4536" w:leader="none"/>
+        <w:tab w:val="right" w:pos="9072" w:leader="none"/>
+      </w:tabs>
+      <w:spacing w:lineRule="auto" w:line="240" w:before="0" w:after="0"/>
+    </w:pPr>
+    <w:rPr/>
+  </w:style>
+  <w:style w:type="paragraph" w:styleId="Notedebasdepage">
+    <w:name w:val="Footnote Text"/>
+    <w:basedOn w:val="Normal"/>
+    <w:link w:val="NotedebasdepageCar"/>
+    <w:uiPriority w:val="99"/>
+    <w:semiHidden/>
+    <w:unhideWhenUsed/>
+    <w:rsid w:val="00164bde"/>
+    <w:pPr>
+      <w:spacing w:lineRule="auto" w:line="240" w:before="0" w:after="0"/>
+    </w:pPr>
+    <w:rPr/>
+  </w:style>
+  <w:style w:type="paragraph" w:styleId="Contenudecadre">
+    <w:name w:val="Contenu de cadre"/>
+    <w:basedOn w:val="Normal"/>
+    <w:qFormat/>
+    <w:pPr/>
+    <w:rPr/>
+  </w:style>
+  <w:style w:type="numbering" w:styleId="NoList" w:default="1">
+    <w:name w:val="No List"/>
+    <w:uiPriority w:val="99"/>
+    <w:semiHidden/>
+    <w:unhideWhenUsed/>
+    <w:qFormat/>
   </w:style>
   <w:style w:type="table" w:default="1" w:styleId="TableauNormal">
     <w:name w:val="Normal Table"/>
@@ -1693,7 +1936,6 @@
     <w:semiHidden/>
     <w:unhideWhenUsed/>
     <w:tblPr>
-      <w:tblInd w:w="0" w:type="dxa"/>
       <w:tblCellMar>
         <w:top w:w="0" w:type="dxa"/>
         <w:left w:w="108" w:type="dxa"/>
@@ -1702,344 +1944,30 @@
       </w:tblCellMar>
     </w:tblPr>
   </w:style>
-  <w:style w:type="numbering" w:default="1" w:styleId="Aucuneliste">
-    <w:name w:val="No List"/>
-    <w:uiPriority w:val="99"/>
-    <w:semiHidden/>
-    <w:unhideWhenUsed/>
-  </w:style>
-  <w:style w:type="character" w:customStyle="1" w:styleId="Titre1Car">
-    <w:name w:val="Titre 1 Car"/>
-    <w:basedOn w:val="Policepardfaut"/>
-    <w:link w:val="Titre1"/>
-    <w:uiPriority w:val="9"/>
-    <w:rsid w:val="00244A41"/>
-    <w:rPr>
-      <w:rFonts w:ascii="Times New Roman" w:eastAsiaTheme="majorEastAsia" w:hAnsi="Times New Roman" w:cs="Times New Roman"/>
-      <w:b/>
-      <w:bCs/>
-      <w:color w:val="000000" w:themeColor="text1"/>
-      <w:sz w:val="28"/>
-      <w:szCs w:val="28"/>
-      <w:lang w:val="en-US"/>
-    </w:rPr>
-  </w:style>
-  <w:style w:type="character" w:customStyle="1" w:styleId="Titre2Car">
-    <w:name w:val="Titre 2 Car"/>
-    <w:basedOn w:val="Policepardfaut"/>
-    <w:link w:val="Titre2"/>
-    <w:uiPriority w:val="9"/>
-    <w:rsid w:val="001C055C"/>
-    <w:rPr>
-      <w:rFonts w:ascii="Times New Roman" w:hAnsi="Times New Roman" w:cs="Times New Roman"/>
-      <w:b/>
-      <w:bCs/>
-      <w:color w:val="000000" w:themeColor="text1"/>
-      <w:sz w:val="22"/>
-      <w:szCs w:val="22"/>
-      <w:lang w:val="en-US"/>
-    </w:rPr>
-  </w:style>
-  <w:style w:type="character" w:customStyle="1" w:styleId="Titre3Car">
-    <w:name w:val="Titre 3 Car"/>
-    <w:basedOn w:val="Policepardfaut"/>
-    <w:link w:val="Titre3"/>
-    <w:uiPriority w:val="9"/>
-    <w:semiHidden/>
-    <w:rsid w:val="0090165C"/>
-    <w:rPr>
-      <w:rFonts w:eastAsiaTheme="majorEastAsia" w:cstheme="majorBidi"/>
-      <w:color w:val="0F4761" w:themeColor="accent1" w:themeShade="BF"/>
-      <w:sz w:val="28"/>
-      <w:szCs w:val="28"/>
-    </w:rPr>
-  </w:style>
-  <w:style w:type="character" w:customStyle="1" w:styleId="Titre4Car">
-    <w:name w:val="Titre 4 Car"/>
-    <w:basedOn w:val="Policepardfaut"/>
-    <w:link w:val="Titre4"/>
-    <w:uiPriority w:val="9"/>
-    <w:semiHidden/>
-    <w:rsid w:val="0090165C"/>
-    <w:rPr>
-      <w:rFonts w:eastAsiaTheme="majorEastAsia" w:cstheme="majorBidi"/>
-      <w:i/>
-      <w:iCs/>
-      <w:color w:val="0F4761" w:themeColor="accent1" w:themeShade="BF"/>
-    </w:rPr>
-  </w:style>
-  <w:style w:type="character" w:customStyle="1" w:styleId="Titre5Car">
-    <w:name w:val="Titre 5 Car"/>
-    <w:basedOn w:val="Policepardfaut"/>
-    <w:link w:val="Titre5"/>
-    <w:uiPriority w:val="9"/>
-    <w:semiHidden/>
-    <w:rsid w:val="0090165C"/>
-    <w:rPr>
-      <w:rFonts w:eastAsiaTheme="majorEastAsia" w:cstheme="majorBidi"/>
-      <w:color w:val="0F4761" w:themeColor="accent1" w:themeShade="BF"/>
-    </w:rPr>
-  </w:style>
-  <w:style w:type="character" w:customStyle="1" w:styleId="Titre6Car">
-    <w:name w:val="Titre 6 Car"/>
-    <w:basedOn w:val="Policepardfaut"/>
-    <w:link w:val="Titre6"/>
-    <w:uiPriority w:val="9"/>
-    <w:semiHidden/>
-    <w:rsid w:val="0090165C"/>
-    <w:rPr>
-      <w:rFonts w:eastAsiaTheme="majorEastAsia" w:cstheme="majorBidi"/>
-      <w:i/>
-      <w:iCs/>
-      <w:color w:val="595959" w:themeColor="text1" w:themeTint="A6"/>
-    </w:rPr>
-  </w:style>
-  <w:style w:type="character" w:customStyle="1" w:styleId="Titre7Car">
-    <w:name w:val="Titre 7 Car"/>
-    <w:basedOn w:val="Policepardfaut"/>
-    <w:link w:val="Titre7"/>
-    <w:uiPriority w:val="9"/>
-    <w:semiHidden/>
-    <w:rsid w:val="0090165C"/>
-    <w:rPr>
-      <w:rFonts w:eastAsiaTheme="majorEastAsia" w:cstheme="majorBidi"/>
-      <w:color w:val="595959" w:themeColor="text1" w:themeTint="A6"/>
-    </w:rPr>
-  </w:style>
-  <w:style w:type="character" w:customStyle="1" w:styleId="Titre8Car">
-    <w:name w:val="Titre 8 Car"/>
-    <w:basedOn w:val="Policepardfaut"/>
-    <w:link w:val="Titre8"/>
-    <w:uiPriority w:val="9"/>
-    <w:semiHidden/>
-    <w:rsid w:val="0090165C"/>
-    <w:rPr>
-      <w:rFonts w:eastAsiaTheme="majorEastAsia" w:cstheme="majorBidi"/>
-      <w:i/>
-      <w:iCs/>
-      <w:color w:val="272727" w:themeColor="text1" w:themeTint="D8"/>
-    </w:rPr>
-  </w:style>
-  <w:style w:type="character" w:customStyle="1" w:styleId="Titre9Car">
-    <w:name w:val="Titre 9 Car"/>
-    <w:basedOn w:val="Policepardfaut"/>
-    <w:link w:val="Titre9"/>
-    <w:uiPriority w:val="9"/>
-    <w:semiHidden/>
-    <w:rsid w:val="0090165C"/>
-    <w:rPr>
-      <w:rFonts w:eastAsiaTheme="majorEastAsia" w:cstheme="majorBidi"/>
-      <w:color w:val="272727" w:themeColor="text1" w:themeTint="D8"/>
-    </w:rPr>
-  </w:style>
-  <w:style w:type="paragraph" w:styleId="Titre">
-    <w:name w:val="Title"/>
-    <w:basedOn w:val="Normal"/>
-    <w:next w:val="Normal"/>
-    <w:link w:val="TitreCar"/>
-    <w:uiPriority w:val="10"/>
-    <w:qFormat/>
-    <w:rsid w:val="0090165C"/>
-    <w:pPr>
-      <w:spacing w:after="80" w:line="240" w:lineRule="auto"/>
-      <w:contextualSpacing/>
-    </w:pPr>
-    <w:rPr>
-      <w:rFonts w:asciiTheme="majorHAnsi" w:eastAsiaTheme="majorEastAsia" w:hAnsiTheme="majorHAnsi" w:cstheme="majorBidi"/>
-      <w:spacing w:val="-10"/>
-      <w:kern w:val="28"/>
-      <w:sz w:val="56"/>
-      <w:szCs w:val="56"/>
-    </w:rPr>
-  </w:style>
-  <w:style w:type="character" w:customStyle="1" w:styleId="TitreCar">
-    <w:name w:val="Titre Car"/>
-    <w:basedOn w:val="Policepardfaut"/>
-    <w:link w:val="Titre"/>
-    <w:uiPriority w:val="10"/>
-    <w:rsid w:val="0090165C"/>
-    <w:rPr>
-      <w:rFonts w:asciiTheme="majorHAnsi" w:eastAsiaTheme="majorEastAsia" w:hAnsiTheme="majorHAnsi" w:cstheme="majorBidi"/>
-      <w:spacing w:val="-10"/>
-      <w:kern w:val="28"/>
-      <w:sz w:val="56"/>
-      <w:szCs w:val="56"/>
-    </w:rPr>
-  </w:style>
-  <w:style w:type="paragraph" w:styleId="Sous-titre">
-    <w:name w:val="Subtitle"/>
-    <w:basedOn w:val="Normal"/>
-    <w:next w:val="Normal"/>
-    <w:link w:val="Sous-titreCar"/>
-    <w:uiPriority w:val="11"/>
-    <w:qFormat/>
-    <w:rsid w:val="0090165C"/>
-    <w:pPr>
-      <w:numPr>
-        <w:ilvl w:val="1"/>
-      </w:numPr>
-    </w:pPr>
-    <w:rPr>
-      <w:rFonts w:eastAsiaTheme="majorEastAsia" w:cstheme="majorBidi"/>
-      <w:color w:val="595959" w:themeColor="text1" w:themeTint="A6"/>
-      <w:spacing w:val="15"/>
-      <w:sz w:val="28"/>
-      <w:szCs w:val="28"/>
-    </w:rPr>
-  </w:style>
-  <w:style w:type="character" w:customStyle="1" w:styleId="Sous-titreCar">
-    <w:name w:val="Sous-titre Car"/>
-    <w:basedOn w:val="Policepardfaut"/>
-    <w:link w:val="Sous-titre"/>
-    <w:uiPriority w:val="11"/>
-    <w:rsid w:val="0090165C"/>
-    <w:rPr>
-      <w:rFonts w:eastAsiaTheme="majorEastAsia" w:cstheme="majorBidi"/>
-      <w:color w:val="595959" w:themeColor="text1" w:themeTint="A6"/>
-      <w:spacing w:val="15"/>
-      <w:sz w:val="28"/>
-      <w:szCs w:val="28"/>
-    </w:rPr>
-  </w:style>
-  <w:style w:type="paragraph" w:styleId="Citation">
-    <w:name w:val="Quote"/>
-    <w:basedOn w:val="Normal"/>
-    <w:next w:val="Normal"/>
-    <w:link w:val="CitationCar"/>
-    <w:uiPriority w:val="29"/>
-    <w:qFormat/>
-    <w:rsid w:val="0090165C"/>
-    <w:pPr>
-      <w:spacing w:before="160"/>
-      <w:jc w:val="center"/>
-    </w:pPr>
-    <w:rPr>
-      <w:i/>
-      <w:iCs/>
-      <w:color w:val="404040" w:themeColor="text1" w:themeTint="BF"/>
-    </w:rPr>
-  </w:style>
-  <w:style w:type="character" w:customStyle="1" w:styleId="CitationCar">
-    <w:name w:val="Citation Car"/>
-    <w:basedOn w:val="Policepardfaut"/>
-    <w:link w:val="Citation"/>
-    <w:uiPriority w:val="29"/>
-    <w:rsid w:val="0090165C"/>
-    <w:rPr>
-      <w:i/>
-      <w:iCs/>
-      <w:color w:val="404040" w:themeColor="text1" w:themeTint="BF"/>
-    </w:rPr>
-  </w:style>
-  <w:style w:type="paragraph" w:styleId="Paragraphedeliste">
-    <w:name w:val="List Paragraph"/>
-    <w:basedOn w:val="Normal"/>
-    <w:uiPriority w:val="34"/>
-    <w:qFormat/>
-    <w:rsid w:val="0090165C"/>
-    <w:pPr>
-      <w:ind w:left="720"/>
-      <w:contextualSpacing/>
-    </w:pPr>
-  </w:style>
-  <w:style w:type="character" w:styleId="Accentuationintense">
-    <w:name w:val="Intense Emphasis"/>
-    <w:basedOn w:val="Policepardfaut"/>
-    <w:uiPriority w:val="21"/>
-    <w:qFormat/>
-    <w:rsid w:val="0090165C"/>
-    <w:rPr>
-      <w:i/>
-      <w:iCs/>
-      <w:color w:val="0F4761" w:themeColor="accent1" w:themeShade="BF"/>
-    </w:rPr>
-  </w:style>
-  <w:style w:type="paragraph" w:styleId="Citationintense">
-    <w:name w:val="Intense Quote"/>
-    <w:basedOn w:val="Normal"/>
-    <w:next w:val="Normal"/>
-    <w:link w:val="CitationintenseCar"/>
-    <w:uiPriority w:val="30"/>
-    <w:qFormat/>
-    <w:rsid w:val="0090165C"/>
-    <w:pPr>
-      <w:pBdr>
-        <w:top w:val="single" w:sz="4" w:space="10" w:color="0F4761" w:themeColor="accent1" w:themeShade="BF"/>
-        <w:bottom w:val="single" w:sz="4" w:space="10" w:color="0F4761" w:themeColor="accent1" w:themeShade="BF"/>
-      </w:pBdr>
-      <w:spacing w:before="360" w:after="360"/>
-      <w:ind w:left="864" w:right="864"/>
-      <w:jc w:val="center"/>
-    </w:pPr>
-    <w:rPr>
-      <w:i/>
-      <w:iCs/>
-      <w:color w:val="0F4761" w:themeColor="accent1" w:themeShade="BF"/>
-    </w:rPr>
-  </w:style>
-  <w:style w:type="character" w:customStyle="1" w:styleId="CitationintenseCar">
-    <w:name w:val="Citation intense Car"/>
-    <w:basedOn w:val="Policepardfaut"/>
-    <w:link w:val="Citationintense"/>
-    <w:uiPriority w:val="30"/>
-    <w:rsid w:val="0090165C"/>
-    <w:rPr>
-      <w:i/>
-      <w:iCs/>
-      <w:color w:val="0F4761" w:themeColor="accent1" w:themeShade="BF"/>
-    </w:rPr>
-  </w:style>
-  <w:style w:type="character" w:styleId="Rfrenceintense">
-    <w:name w:val="Intense Reference"/>
-    <w:basedOn w:val="Policepardfaut"/>
-    <w:uiPriority w:val="32"/>
-    <w:qFormat/>
-    <w:rsid w:val="0090165C"/>
-    <w:rPr>
-      <w:b/>
-      <w:bCs/>
-      <w:smallCaps/>
-      <w:color w:val="0F4761" w:themeColor="accent1" w:themeShade="BF"/>
-      <w:spacing w:val="5"/>
-    </w:rPr>
-  </w:style>
   <w:style w:type="table" w:styleId="Grilledutableau">
     <w:name w:val="Table Grid"/>
     <w:basedOn w:val="TableauNormal"/>
     <w:uiPriority w:val="39"/>
-    <w:rsid w:val="00474EB4"/>
+    <w:rsid w:val="00474eb4"/>
     <w:pPr>
       <w:spacing w:after="0" w:line="240" w:lineRule="auto"/>
     </w:pPr>
     <w:tblPr>
       <w:tblBorders>
-        <w:top w:val="single" w:sz="4" w:space="0" w:color="auto"/>
-        <w:left w:val="single" w:sz="4" w:space="0" w:color="auto"/>
-        <w:bottom w:val="single" w:sz="4" w:space="0" w:color="auto"/>
-        <w:right w:val="single" w:sz="4" w:space="0" w:color="auto"/>
-        <w:insideH w:val="single" w:sz="4" w:space="0" w:color="auto"/>
-        <w:insideV w:val="single" w:sz="4" w:space="0" w:color="auto"/>
+        <w:top w:val="single" w:color="auto" w:sz="4" w:space="0"/>
+        <w:left w:val="single" w:color="auto" w:sz="4" w:space="0"/>
+        <w:bottom w:val="single" w:color="auto" w:sz="4" w:space="0"/>
+        <w:right w:val="single" w:color="auto" w:sz="4" w:space="0"/>
+        <w:insideH w:val="single" w:color="auto" w:sz="4" w:space="0"/>
+        <w:insideV w:val="single" w:color="auto" w:sz="4" w:space="0"/>
       </w:tblBorders>
     </w:tblPr>
-  </w:style>
-  <w:style w:type="character" w:styleId="lev">
-    <w:name w:val="Strong"/>
-    <w:basedOn w:val="Policepardfaut"/>
-    <w:uiPriority w:val="22"/>
-    <w:qFormat/>
-    <w:rsid w:val="00AE6614"/>
-    <w:rPr>
-      <w:b/>
-      <w:bCs/>
-      <w:sz w:val="18"/>
-      <w:szCs w:val="18"/>
-    </w:rPr>
   </w:style>
   <w:style w:type="table" w:styleId="TableauGrille4">
     <w:name w:val="Grid Table 4"/>
     <w:basedOn w:val="TableauNormal"/>
     <w:uiPriority w:val="49"/>
-    <w:rsid w:val="00F66FE9"/>
+    <w:rsid w:val="00f66fe9"/>
     <w:pPr>
       <w:spacing w:after="0" w:line="240" w:lineRule="auto"/>
     </w:pPr>
@@ -2047,12 +1975,12 @@
       <w:tblStyleRowBandSize w:val="1"/>
       <w:tblStyleColBandSize w:val="1"/>
       <w:tblBorders>
-        <w:top w:val="single" w:sz="4" w:space="0" w:color="666666" w:themeColor="text1" w:themeTint="99"/>
-        <w:left w:val="single" w:sz="4" w:space="0" w:color="666666" w:themeColor="text1" w:themeTint="99"/>
-        <w:bottom w:val="single" w:sz="4" w:space="0" w:color="666666" w:themeColor="text1" w:themeTint="99"/>
-        <w:right w:val="single" w:sz="4" w:space="0" w:color="666666" w:themeColor="text1" w:themeTint="99"/>
-        <w:insideH w:val="single" w:sz="4" w:space="0" w:color="666666" w:themeColor="text1" w:themeTint="99"/>
-        <w:insideV w:val="single" w:sz="4" w:space="0" w:color="666666" w:themeColor="text1" w:themeTint="99"/>
+        <w:top w:val="single" w:color="666666" w:themeColor="text1" w:themeTint="99" w:sz="4" w:space="0"/>
+        <w:left w:val="single" w:color="666666" w:themeColor="text1" w:themeTint="99" w:sz="4" w:space="0"/>
+        <w:bottom w:val="single" w:color="666666" w:themeColor="text1" w:themeTint="99" w:sz="4" w:space="0"/>
+        <w:right w:val="single" w:color="666666" w:themeColor="text1" w:themeTint="99" w:sz="4" w:space="0"/>
+        <w:insideH w:val="single" w:color="666666" w:themeColor="text1" w:themeTint="99" w:sz="4" w:space="0"/>
+        <w:insideV w:val="single" w:color="666666" w:themeColor="text1" w:themeTint="99" w:sz="4" w:space="0"/>
       </w:tblBorders>
     </w:tblPr>
     <w:tblStylePr w:type="firstRow">
@@ -2064,10 +1992,10 @@
       <w:tblPr/>
       <w:tcPr>
         <w:tcBorders>
-          <w:top w:val="single" w:sz="4" w:space="0" w:color="000000" w:themeColor="text1"/>
-          <w:left w:val="single" w:sz="4" w:space="0" w:color="000000" w:themeColor="text1"/>
-          <w:bottom w:val="single" w:sz="4" w:space="0" w:color="000000" w:themeColor="text1"/>
-          <w:right w:val="single" w:sz="4" w:space="0" w:color="000000" w:themeColor="text1"/>
+          <w:top w:val="single" w:color="000000" w:themeColor="text1" w:sz="4" w:space="0"/>
+          <w:left w:val="single" w:color="000000" w:themeColor="text1" w:sz="4" w:space="0"/>
+          <w:bottom w:val="single" w:color="000000" w:themeColor="text1" w:sz="4" w:space="0"/>
+          <w:right w:val="single" w:color="000000" w:themeColor="text1" w:sz="4" w:space="0"/>
           <w:insideH w:val="nil"/>
           <w:insideV w:val="nil"/>
         </w:tcBorders>
@@ -2082,7 +2010,7 @@
       <w:tblPr/>
       <w:tcPr>
         <w:tcBorders>
-          <w:top w:val="double" w:sz="4" w:space="0" w:color="000000" w:themeColor="text1"/>
+          <w:top w:val="double" w:color="000000" w:themeColor="text1" w:sz="4" w:space="0"/>
         </w:tcBorders>
       </w:tcPr>
     </w:tblStylePr>
@@ -2091,12 +2019,14 @@
         <w:b/>
         <w:bCs/>
       </w:rPr>
+      <w:tblPr/>
     </w:tblStylePr>
     <w:tblStylePr w:type="lastCol">
       <w:rPr>
         <w:b/>
         <w:bCs/>
       </w:rPr>
+      <w:tblPr/>
     </w:tblStylePr>
     <w:tblStylePr w:type="band1Vert">
       <w:tblPr/>
@@ -2115,7 +2045,7 @@
     <w:name w:val="Grid Table 4 Accent 1"/>
     <w:basedOn w:val="TableauNormal"/>
     <w:uiPriority w:val="49"/>
-    <w:rsid w:val="00A66A4D"/>
+    <w:rsid w:val="00a66a4d"/>
     <w:pPr>
       <w:spacing w:after="0" w:line="240" w:lineRule="auto"/>
     </w:pPr>
@@ -2123,12 +2053,12 @@
       <w:tblStyleRowBandSize w:val="1"/>
       <w:tblStyleColBandSize w:val="1"/>
       <w:tblBorders>
-        <w:top w:val="single" w:sz="4" w:space="0" w:color="45B0E1" w:themeColor="accent1" w:themeTint="99"/>
-        <w:left w:val="single" w:sz="4" w:space="0" w:color="45B0E1" w:themeColor="accent1" w:themeTint="99"/>
-        <w:bottom w:val="single" w:sz="4" w:space="0" w:color="45B0E1" w:themeColor="accent1" w:themeTint="99"/>
-        <w:right w:val="single" w:sz="4" w:space="0" w:color="45B0E1" w:themeColor="accent1" w:themeTint="99"/>
-        <w:insideH w:val="single" w:sz="4" w:space="0" w:color="45B0E1" w:themeColor="accent1" w:themeTint="99"/>
-        <w:insideV w:val="single" w:sz="4" w:space="0" w:color="45B0E1" w:themeColor="accent1" w:themeTint="99"/>
+        <w:top w:val="single" w:color="45B0E1" w:themeColor="accent1" w:themeTint="99" w:sz="4" w:space="0"/>
+        <w:left w:val="single" w:color="45B0E1" w:themeColor="accent1" w:themeTint="99" w:sz="4" w:space="0"/>
+        <w:bottom w:val="single" w:color="45B0E1" w:themeColor="accent1" w:themeTint="99" w:sz="4" w:space="0"/>
+        <w:right w:val="single" w:color="45B0E1" w:themeColor="accent1" w:themeTint="99" w:sz="4" w:space="0"/>
+        <w:insideH w:val="single" w:color="45B0E1" w:themeColor="accent1" w:themeTint="99" w:sz="4" w:space="0"/>
+        <w:insideV w:val="single" w:color="45B0E1" w:themeColor="accent1" w:themeTint="99" w:sz="4" w:space="0"/>
       </w:tblBorders>
     </w:tblPr>
     <w:tblStylePr w:type="firstRow">
@@ -2140,10 +2070,10 @@
       <w:tblPr/>
       <w:tcPr>
         <w:tcBorders>
-          <w:top w:val="single" w:sz="4" w:space="0" w:color="156082" w:themeColor="accent1"/>
-          <w:left w:val="single" w:sz="4" w:space="0" w:color="156082" w:themeColor="accent1"/>
-          <w:bottom w:val="single" w:sz="4" w:space="0" w:color="156082" w:themeColor="accent1"/>
-          <w:right w:val="single" w:sz="4" w:space="0" w:color="156082" w:themeColor="accent1"/>
+          <w:top w:val="single" w:color="156082" w:themeColor="accent1" w:sz="4" w:space="0"/>
+          <w:left w:val="single" w:color="156082" w:themeColor="accent1" w:sz="4" w:space="0"/>
+          <w:bottom w:val="single" w:color="156082" w:themeColor="accent1" w:sz="4" w:space="0"/>
+          <w:right w:val="single" w:color="156082" w:themeColor="accent1" w:sz="4" w:space="0"/>
           <w:insideH w:val="nil"/>
           <w:insideV w:val="nil"/>
         </w:tcBorders>
@@ -2158,7 +2088,7 @@
       <w:tblPr/>
       <w:tcPr>
         <w:tcBorders>
-          <w:top w:val="double" w:sz="4" w:space="0" w:color="156082" w:themeColor="accent1"/>
+          <w:top w:val="double" w:color="156082" w:themeColor="accent1" w:sz="4" w:space="0"/>
         </w:tcBorders>
       </w:tcPr>
     </w:tblStylePr>
@@ -2167,12 +2097,14 @@
         <w:b/>
         <w:bCs/>
       </w:rPr>
+      <w:tblPr/>
     </w:tblStylePr>
     <w:tblStylePr w:type="lastCol">
       <w:rPr>
         <w:b/>
         <w:bCs/>
       </w:rPr>
+      <w:tblPr/>
     </w:tblStylePr>
     <w:tblStylePr w:type="band1Vert">
       <w:tblPr/>
@@ -2191,7 +2123,7 @@
     <w:name w:val="Grid Table 3 Accent 5"/>
     <w:basedOn w:val="TableauNormal"/>
     <w:uiPriority w:val="48"/>
-    <w:rsid w:val="001B55BB"/>
+    <w:rsid w:val="001b55bb"/>
     <w:pPr>
       <w:spacing w:after="0" w:line="240" w:lineRule="auto"/>
     </w:pPr>
@@ -2199,12 +2131,12 @@
       <w:tblStyleRowBandSize w:val="1"/>
       <w:tblStyleColBandSize w:val="1"/>
       <w:tblBorders>
-        <w:top w:val="single" w:sz="4" w:space="0" w:color="D86DCB" w:themeColor="accent5" w:themeTint="99"/>
-        <w:left w:val="single" w:sz="4" w:space="0" w:color="D86DCB" w:themeColor="accent5" w:themeTint="99"/>
-        <w:bottom w:val="single" w:sz="4" w:space="0" w:color="D86DCB" w:themeColor="accent5" w:themeTint="99"/>
-        <w:right w:val="single" w:sz="4" w:space="0" w:color="D86DCB" w:themeColor="accent5" w:themeTint="99"/>
-        <w:insideH w:val="single" w:sz="4" w:space="0" w:color="D86DCB" w:themeColor="accent5" w:themeTint="99"/>
-        <w:insideV w:val="single" w:sz="4" w:space="0" w:color="D86DCB" w:themeColor="accent5" w:themeTint="99"/>
+        <w:top w:val="single" w:color="D86DCB" w:themeColor="accent5" w:themeTint="99" w:sz="4" w:space="0"/>
+        <w:left w:val="single" w:color="D86DCB" w:themeColor="accent5" w:themeTint="99" w:sz="4" w:space="0"/>
+        <w:bottom w:val="single" w:color="D86DCB" w:themeColor="accent5" w:themeTint="99" w:sz="4" w:space="0"/>
+        <w:right w:val="single" w:color="D86DCB" w:themeColor="accent5" w:themeTint="99" w:sz="4" w:space="0"/>
+        <w:insideH w:val="single" w:color="D86DCB" w:themeColor="accent5" w:themeTint="99" w:sz="4" w:space="0"/>
+        <w:insideV w:val="single" w:color="D86DCB" w:themeColor="accent5" w:themeTint="99" w:sz="4" w:space="0"/>
       </w:tblBorders>
     </w:tblPr>
     <w:tblStylePr w:type="firstRow">
@@ -2247,7 +2179,6 @@
       </w:pPr>
       <w:rPr>
         <w:i/>
-        <w:iCs/>
       </w:rPr>
       <w:tblPr/>
       <w:tcPr>
@@ -2264,7 +2195,6 @@
     <w:tblStylePr w:type="lastCol">
       <w:rPr>
         <w:i/>
-        <w:iCs/>
       </w:rPr>
       <w:tblPr/>
       <w:tcPr>
@@ -2294,7 +2224,7 @@
       <w:tblPr/>
       <w:tcPr>
         <w:tcBorders>
-          <w:bottom w:val="single" w:sz="4" w:space="0" w:color="D86DCB" w:themeColor="accent5" w:themeTint="99"/>
+          <w:bottom w:val="single" w:color="D86DCB" w:themeColor="accent5" w:sz="4" w:space="0"/>
         </w:tcBorders>
       </w:tcPr>
     </w:tblStylePr>
@@ -2302,7 +2232,7 @@
       <w:tblPr/>
       <w:tcPr>
         <w:tcBorders>
-          <w:bottom w:val="single" w:sz="4" w:space="0" w:color="D86DCB" w:themeColor="accent5" w:themeTint="99"/>
+          <w:bottom w:val="single" w:color="D86DCB" w:themeColor="accent5" w:sz="4" w:space="0"/>
         </w:tcBorders>
       </w:tcPr>
     </w:tblStylePr>
@@ -2310,7 +2240,7 @@
       <w:tblPr/>
       <w:tcPr>
         <w:tcBorders>
-          <w:top w:val="single" w:sz="4" w:space="0" w:color="D86DCB" w:themeColor="accent5" w:themeTint="99"/>
+          <w:top w:val="single" w:color="D86DCB" w:themeColor="accent5" w:sz="4" w:space="0"/>
         </w:tcBorders>
       </w:tcPr>
     </w:tblStylePr>
@@ -2318,7 +2248,7 @@
       <w:tblPr/>
       <w:tcPr>
         <w:tcBorders>
-          <w:top w:val="single" w:sz="4" w:space="0" w:color="D86DCB" w:themeColor="accent5" w:themeTint="99"/>
+          <w:top w:val="single" w:color="D86DCB" w:themeColor="accent5" w:sz="4" w:space="0"/>
         </w:tcBorders>
       </w:tcPr>
     </w:tblStylePr>
@@ -2327,7 +2257,7 @@
     <w:name w:val="Plain Table 1"/>
     <w:basedOn w:val="TableauNormal"/>
     <w:uiPriority w:val="41"/>
-    <w:rsid w:val="001B55BB"/>
+    <w:rsid w:val="001b55bb"/>
     <w:pPr>
       <w:spacing w:after="0" w:line="240" w:lineRule="auto"/>
     </w:pPr>
@@ -2335,12 +2265,12 @@
       <w:tblStyleRowBandSize w:val="1"/>
       <w:tblStyleColBandSize w:val="1"/>
       <w:tblBorders>
-        <w:top w:val="single" w:sz="4" w:space="0" w:color="BFBFBF" w:themeColor="background1" w:themeShade="BF"/>
-        <w:left w:val="single" w:sz="4" w:space="0" w:color="BFBFBF" w:themeColor="background1" w:themeShade="BF"/>
-        <w:bottom w:val="single" w:sz="4" w:space="0" w:color="BFBFBF" w:themeColor="background1" w:themeShade="BF"/>
-        <w:right w:val="single" w:sz="4" w:space="0" w:color="BFBFBF" w:themeColor="background1" w:themeShade="BF"/>
-        <w:insideH w:val="single" w:sz="4" w:space="0" w:color="BFBFBF" w:themeColor="background1" w:themeShade="BF"/>
-        <w:insideV w:val="single" w:sz="4" w:space="0" w:color="BFBFBF" w:themeColor="background1" w:themeShade="BF"/>
+        <w:top w:val="single" w:color="BFBFBF" w:themeColor="background1" w:sz="4" w:space="0"/>
+        <w:left w:val="single" w:color="BFBFBF" w:themeColor="background1" w:sz="4" w:space="0"/>
+        <w:bottom w:val="single" w:color="BFBFBF" w:themeColor="background1" w:sz="4" w:space="0"/>
+        <w:right w:val="single" w:color="BFBFBF" w:themeColor="background1" w:sz="4" w:space="0"/>
+        <w:insideH w:val="single" w:color="BFBFBF" w:themeColor="background1" w:sz="4" w:space="0"/>
+        <w:insideV w:val="single" w:color="BFBFBF" w:themeColor="background1" w:sz="4" w:space="0"/>
       </w:tblBorders>
     </w:tblPr>
     <w:tblStylePr w:type="firstRow">
@@ -2348,6 +2278,7 @@
         <w:b/>
         <w:bCs/>
       </w:rPr>
+      <w:tblPr/>
     </w:tblStylePr>
     <w:tblStylePr w:type="lastRow">
       <w:rPr>
@@ -2357,7 +2288,7 @@
       <w:tblPr/>
       <w:tcPr>
         <w:tcBorders>
-          <w:top w:val="double" w:sz="4" w:space="0" w:color="BFBFBF" w:themeColor="background1" w:themeShade="BF"/>
+          <w:top w:val="double" w:color="BFBFBF" w:themeColor="background1" w:sz="4" w:space="0"/>
         </w:tcBorders>
       </w:tcPr>
     </w:tblStylePr>
@@ -2366,23 +2297,25 @@
         <w:b/>
         <w:bCs/>
       </w:rPr>
+      <w:tblPr/>
     </w:tblStylePr>
     <w:tblStylePr w:type="lastCol">
       <w:rPr>
         <w:b/>
         <w:bCs/>
       </w:rPr>
+      <w:tblPr/>
     </w:tblStylePr>
     <w:tblStylePr w:type="band1Vert">
       <w:tblPr/>
       <w:tcPr>
-        <w:shd w:val="clear" w:color="auto" w:fill="F2F2F2" w:themeFill="background1" w:themeFillShade="F2"/>
+        <w:shd w:val="clear" w:color="auto" w:fill="F2F2F2" w:themeFill="background1" w:themeFillShade="f2"/>
       </w:tcPr>
     </w:tblStylePr>
     <w:tblStylePr w:type="band1Horz">
       <w:tblPr/>
       <w:tcPr>
-        <w:shd w:val="clear" w:color="auto" w:fill="F2F2F2" w:themeFill="background1" w:themeFillShade="F2"/>
+        <w:shd w:val="clear" w:color="auto" w:fill="F2F2F2" w:themeFill="background1" w:themeFillShade="f2"/>
       </w:tcPr>
     </w:tblStylePr>
   </w:style>
@@ -2390,7 +2323,7 @@
     <w:name w:val="Grid Table 3 Accent 6"/>
     <w:basedOn w:val="TableauNormal"/>
     <w:uiPriority w:val="48"/>
-    <w:rsid w:val="00A66A4D"/>
+    <w:rsid w:val="00a66a4d"/>
     <w:pPr>
       <w:spacing w:after="0" w:line="240" w:lineRule="auto"/>
     </w:pPr>
@@ -2398,12 +2331,12 @@
       <w:tblStyleRowBandSize w:val="1"/>
       <w:tblStyleColBandSize w:val="1"/>
       <w:tblBorders>
-        <w:top w:val="single" w:sz="4" w:space="0" w:color="8DD873" w:themeColor="accent6" w:themeTint="99"/>
-        <w:left w:val="single" w:sz="4" w:space="0" w:color="8DD873" w:themeColor="accent6" w:themeTint="99"/>
-        <w:bottom w:val="single" w:sz="4" w:space="0" w:color="8DD873" w:themeColor="accent6" w:themeTint="99"/>
-        <w:right w:val="single" w:sz="4" w:space="0" w:color="8DD873" w:themeColor="accent6" w:themeTint="99"/>
-        <w:insideH w:val="single" w:sz="4" w:space="0" w:color="8DD873" w:themeColor="accent6" w:themeTint="99"/>
-        <w:insideV w:val="single" w:sz="4" w:space="0" w:color="8DD873" w:themeColor="accent6" w:themeTint="99"/>
+        <w:top w:val="single" w:color="8DD873" w:themeColor="accent6" w:themeTint="99" w:sz="4" w:space="0"/>
+        <w:left w:val="single" w:color="8DD873" w:themeColor="accent6" w:themeTint="99" w:sz="4" w:space="0"/>
+        <w:bottom w:val="single" w:color="8DD873" w:themeColor="accent6" w:themeTint="99" w:sz="4" w:space="0"/>
+        <w:right w:val="single" w:color="8DD873" w:themeColor="accent6" w:themeTint="99" w:sz="4" w:space="0"/>
+        <w:insideH w:val="single" w:color="8DD873" w:themeColor="accent6" w:themeTint="99" w:sz="4" w:space="0"/>
+        <w:insideV w:val="single" w:color="8DD873" w:themeColor="accent6" w:themeTint="99" w:sz="4" w:space="0"/>
       </w:tblBorders>
     </w:tblPr>
     <w:tblStylePr w:type="firstRow">
@@ -2446,7 +2379,6 @@
       </w:pPr>
       <w:rPr>
         <w:i/>
-        <w:iCs/>
       </w:rPr>
       <w:tblPr/>
       <w:tcPr>
@@ -2463,7 +2395,6 @@
     <w:tblStylePr w:type="lastCol">
       <w:rPr>
         <w:i/>
-        <w:iCs/>
       </w:rPr>
       <w:tblPr/>
       <w:tcPr>
@@ -2493,7 +2424,7 @@
       <w:tblPr/>
       <w:tcPr>
         <w:tcBorders>
-          <w:bottom w:val="single" w:sz="4" w:space="0" w:color="8DD873" w:themeColor="accent6" w:themeTint="99"/>
+          <w:bottom w:val="single" w:color="8DD873" w:themeColor="accent6" w:sz="4" w:space="0"/>
         </w:tcBorders>
       </w:tcPr>
     </w:tblStylePr>
@@ -2501,7 +2432,7 @@
       <w:tblPr/>
       <w:tcPr>
         <w:tcBorders>
-          <w:bottom w:val="single" w:sz="4" w:space="0" w:color="8DD873" w:themeColor="accent6" w:themeTint="99"/>
+          <w:bottom w:val="single" w:color="8DD873" w:themeColor="accent6" w:sz="4" w:space="0"/>
         </w:tcBorders>
       </w:tcPr>
     </w:tblStylePr>
@@ -2509,7 +2440,7 @@
       <w:tblPr/>
       <w:tcPr>
         <w:tcBorders>
-          <w:top w:val="single" w:sz="4" w:space="0" w:color="8DD873" w:themeColor="accent6" w:themeTint="99"/>
+          <w:top w:val="single" w:color="8DD873" w:themeColor="accent6" w:sz="4" w:space="0"/>
         </w:tcBorders>
       </w:tcPr>
     </w:tblStylePr>
@@ -2517,7 +2448,7 @@
       <w:tblPr/>
       <w:tcPr>
         <w:tcBorders>
-          <w:top w:val="single" w:sz="4" w:space="0" w:color="8DD873" w:themeColor="accent6" w:themeTint="99"/>
+          <w:top w:val="single" w:color="8DD873" w:themeColor="accent6" w:sz="4" w:space="0"/>
         </w:tcBorders>
       </w:tcPr>
     </w:tblStylePr>
@@ -2526,7 +2457,7 @@
     <w:name w:val="Grid Table 5 Dark"/>
     <w:basedOn w:val="TableauNormal"/>
     <w:uiPriority w:val="50"/>
-    <w:rsid w:val="00A66A4D"/>
+    <w:rsid w:val="00a66a4d"/>
     <w:pPr>
       <w:spacing w:after="0" w:line="240" w:lineRule="auto"/>
     </w:pPr>
@@ -2534,12 +2465,12 @@
       <w:tblStyleRowBandSize w:val="1"/>
       <w:tblStyleColBandSize w:val="1"/>
       <w:tblBorders>
-        <w:top w:val="single" w:sz="4" w:space="0" w:color="FFFFFF" w:themeColor="background1"/>
-        <w:left w:val="single" w:sz="4" w:space="0" w:color="FFFFFF" w:themeColor="background1"/>
-        <w:bottom w:val="single" w:sz="4" w:space="0" w:color="FFFFFF" w:themeColor="background1"/>
-        <w:right w:val="single" w:sz="4" w:space="0" w:color="FFFFFF" w:themeColor="background1"/>
-        <w:insideH w:val="single" w:sz="4" w:space="0" w:color="FFFFFF" w:themeColor="background1"/>
-        <w:insideV w:val="single" w:sz="4" w:space="0" w:color="FFFFFF" w:themeColor="background1"/>
+        <w:top w:val="single" w:color="FFFFFF" w:themeColor="background1" w:sz="4" w:space="0"/>
+        <w:left w:val="single" w:color="FFFFFF" w:themeColor="background1" w:sz="4" w:space="0"/>
+        <w:bottom w:val="single" w:color="FFFFFF" w:themeColor="background1" w:sz="4" w:space="0"/>
+        <w:right w:val="single" w:color="FFFFFF" w:themeColor="background1" w:sz="4" w:space="0"/>
+        <w:insideH w:val="single" w:color="FFFFFF" w:themeColor="background1" w:sz="4" w:space="0"/>
+        <w:insideV w:val="single" w:color="FFFFFF" w:themeColor="background1" w:sz="4" w:space="0"/>
       </w:tblBorders>
     </w:tblPr>
     <w:tcPr>
@@ -2554,9 +2485,9 @@
       <w:tblPr/>
       <w:tcPr>
         <w:tcBorders>
-          <w:top w:val="single" w:sz="4" w:space="0" w:color="FFFFFF" w:themeColor="background1"/>
-          <w:left w:val="single" w:sz="4" w:space="0" w:color="FFFFFF" w:themeColor="background1"/>
-          <w:right w:val="single" w:sz="4" w:space="0" w:color="FFFFFF" w:themeColor="background1"/>
+          <w:top w:val="single" w:color="FFFFFF" w:themeColor="background1" w:sz="4" w:space="0"/>
+          <w:left w:val="single" w:color="FFFFFF" w:themeColor="background1" w:sz="4" w:space="0"/>
+          <w:right w:val="single" w:color="FFFFFF" w:themeColor="background1" w:sz="4" w:space="0"/>
           <w:insideH w:val="nil"/>
           <w:insideV w:val="nil"/>
         </w:tcBorders>
@@ -2572,9 +2503,9 @@
       <w:tblPr/>
       <w:tcPr>
         <w:tcBorders>
-          <w:left w:val="single" w:sz="4" w:space="0" w:color="FFFFFF" w:themeColor="background1"/>
-          <w:bottom w:val="single" w:sz="4" w:space="0" w:color="FFFFFF" w:themeColor="background1"/>
-          <w:right w:val="single" w:sz="4" w:space="0" w:color="FFFFFF" w:themeColor="background1"/>
+          <w:left w:val="single" w:color="FFFFFF" w:themeColor="background1" w:sz="4" w:space="0"/>
+          <w:bottom w:val="single" w:color="FFFFFF" w:themeColor="background1" w:sz="4" w:space="0"/>
+          <w:right w:val="single" w:color="FFFFFF" w:themeColor="background1" w:sz="4" w:space="0"/>
           <w:insideH w:val="nil"/>
           <w:insideV w:val="nil"/>
         </w:tcBorders>
@@ -2590,9 +2521,9 @@
       <w:tblPr/>
       <w:tcPr>
         <w:tcBorders>
-          <w:top w:val="single" w:sz="4" w:space="0" w:color="FFFFFF" w:themeColor="background1"/>
-          <w:left w:val="single" w:sz="4" w:space="0" w:color="FFFFFF" w:themeColor="background1"/>
-          <w:bottom w:val="single" w:sz="4" w:space="0" w:color="FFFFFF" w:themeColor="background1"/>
+          <w:top w:val="single" w:color="FFFFFF" w:themeColor="background1" w:sz="4" w:space="0"/>
+          <w:left w:val="single" w:color="FFFFFF" w:themeColor="background1" w:sz="4" w:space="0"/>
+          <w:bottom w:val="single" w:color="FFFFFF" w:themeColor="background1" w:sz="4" w:space="0"/>
           <w:insideV w:val="nil"/>
         </w:tcBorders>
         <w:shd w:val="clear" w:color="auto" w:fill="000000" w:themeFill="text1"/>
@@ -2607,9 +2538,9 @@
       <w:tblPr/>
       <w:tcPr>
         <w:tcBorders>
-          <w:top w:val="single" w:sz="4" w:space="0" w:color="FFFFFF" w:themeColor="background1"/>
-          <w:bottom w:val="single" w:sz="4" w:space="0" w:color="FFFFFF" w:themeColor="background1"/>
-          <w:right w:val="single" w:sz="4" w:space="0" w:color="FFFFFF" w:themeColor="background1"/>
+          <w:top w:val="single" w:color="FFFFFF" w:themeColor="background1" w:sz="4" w:space="0"/>
+          <w:bottom w:val="single" w:color="FFFFFF" w:themeColor="background1" w:sz="4" w:space="0"/>
+          <w:right w:val="single" w:color="FFFFFF" w:themeColor="background1" w:sz="4" w:space="0"/>
           <w:insideV w:val="nil"/>
         </w:tcBorders>
         <w:shd w:val="clear" w:color="auto" w:fill="000000" w:themeFill="text1"/>
@@ -2632,22 +2563,19 @@
     <w:name w:val="StyleTableauRes"/>
     <w:basedOn w:val="Grilledutableau"/>
     <w:uiPriority w:val="99"/>
-    <w:rsid w:val="005377B4"/>
-    <w:rPr>
-      <w:rFonts w:ascii="Times New Roman" w:hAnsi="Times New Roman"/>
+    <w:rsid w:val="005377b4"/>
+    <w:rPr>
       <w:color w:val="000000" w:themeColor="text1"/>
       <w:sz w:val="18"/>
     </w:rPr>
-    <w:tblPr/>
     <w:tblStylePr w:type="firstRow">
       <w:rPr>
-        <w:rFonts w:ascii="Times New Roman" w:hAnsi="Times New Roman"/>
         <w:b/>
         <w:i w:val="0"/>
       </w:rPr>
       <w:tblPr/>
       <w:tcPr>
-        <w:shd w:val="clear" w:color="auto" w:fill="D1D1D1" w:themeFill="background2" w:themeFillShade="E6"/>
+        <w:shd w:val="clear" w:color="auto" w:fill="D1D1D1" w:themeFill="background2" w:themeFillShade="e6"/>
       </w:tcPr>
     </w:tblStylePr>
     <w:tblStylePr w:type="lastRow">
@@ -2655,25 +2583,28 @@
         <w:b/>
         <w:bCs/>
       </w:rPr>
+      <w:tblPr/>
     </w:tblStylePr>
     <w:tblStylePr w:type="firstCol">
       <w:rPr>
         <w:b/>
         <w:bCs/>
       </w:rPr>
+      <w:tblPr/>
     </w:tblStylePr>
     <w:tblStylePr w:type="lastCol">
       <w:rPr>
         <w:b/>
         <w:bCs/>
       </w:rPr>
+      <w:tblPr/>
     </w:tblStylePr>
   </w:style>
   <w:style w:type="table" w:styleId="TableauListe4">
     <w:name w:val="List Table 4"/>
     <w:basedOn w:val="TableauNormal"/>
     <w:uiPriority w:val="49"/>
-    <w:rsid w:val="00FD69D4"/>
+    <w:rsid w:val="00fd69d4"/>
     <w:pPr>
       <w:spacing w:after="0" w:line="240" w:lineRule="auto"/>
     </w:pPr>
@@ -2681,11 +2612,11 @@
       <w:tblStyleRowBandSize w:val="1"/>
       <w:tblStyleColBandSize w:val="1"/>
       <w:tblBorders>
-        <w:top w:val="single" w:sz="4" w:space="0" w:color="666666" w:themeColor="text1" w:themeTint="99"/>
-        <w:left w:val="single" w:sz="4" w:space="0" w:color="666666" w:themeColor="text1" w:themeTint="99"/>
-        <w:bottom w:val="single" w:sz="4" w:space="0" w:color="666666" w:themeColor="text1" w:themeTint="99"/>
-        <w:right w:val="single" w:sz="4" w:space="0" w:color="666666" w:themeColor="text1" w:themeTint="99"/>
-        <w:insideH w:val="single" w:sz="4" w:space="0" w:color="666666" w:themeColor="text1" w:themeTint="99"/>
+        <w:top w:val="single" w:color="666666" w:themeColor="text1" w:themeTint="99" w:sz="4" w:space="0"/>
+        <w:left w:val="single" w:color="666666" w:themeColor="text1" w:themeTint="99" w:sz="4" w:space="0"/>
+        <w:bottom w:val="single" w:color="666666" w:themeColor="text1" w:themeTint="99" w:sz="4" w:space="0"/>
+        <w:right w:val="single" w:color="666666" w:themeColor="text1" w:themeTint="99" w:sz="4" w:space="0"/>
+        <w:insideH w:val="single" w:color="666666" w:themeColor="text1" w:themeTint="99" w:sz="4" w:space="0"/>
       </w:tblBorders>
     </w:tblPr>
     <w:tblStylePr w:type="firstRow">
@@ -2697,10 +2628,10 @@
       <w:tblPr/>
       <w:tcPr>
         <w:tcBorders>
-          <w:top w:val="single" w:sz="4" w:space="0" w:color="000000" w:themeColor="text1"/>
-          <w:left w:val="single" w:sz="4" w:space="0" w:color="000000" w:themeColor="text1"/>
-          <w:bottom w:val="single" w:sz="4" w:space="0" w:color="000000" w:themeColor="text1"/>
-          <w:right w:val="single" w:sz="4" w:space="0" w:color="000000" w:themeColor="text1"/>
+          <w:top w:val="single" w:color="000000" w:themeColor="text1" w:sz="4" w:space="0"/>
+          <w:left w:val="single" w:color="000000" w:themeColor="text1" w:sz="4" w:space="0"/>
+          <w:bottom w:val="single" w:color="000000" w:themeColor="text1" w:sz="4" w:space="0"/>
+          <w:right w:val="single" w:color="000000" w:themeColor="text1" w:sz="4" w:space="0"/>
           <w:insideH w:val="nil"/>
         </w:tcBorders>
         <w:shd w:val="clear" w:color="auto" w:fill="000000" w:themeFill="text1"/>
@@ -2714,7 +2645,7 @@
       <w:tblPr/>
       <w:tcPr>
         <w:tcBorders>
-          <w:top w:val="double" w:sz="4" w:space="0" w:color="666666" w:themeColor="text1" w:themeTint="99"/>
+          <w:top w:val="double" w:color="666666" w:themeColor="text1" w:sz="4" w:space="0"/>
         </w:tcBorders>
       </w:tcPr>
     </w:tblStylePr>
@@ -2723,12 +2654,14 @@
         <w:b/>
         <w:bCs/>
       </w:rPr>
+      <w:tblPr/>
     </w:tblStylePr>
     <w:tblStylePr w:type="lastCol">
       <w:rPr>
         <w:b/>
         <w:bCs/>
       </w:rPr>
+      <w:tblPr/>
     </w:tblStylePr>
     <w:tblStylePr w:type="band1Vert">
       <w:tblPr/>
@@ -2742,102 +2675,6 @@
         <w:shd w:val="clear" w:color="auto" w:fill="CCCCCC" w:themeFill="text1" w:themeFillTint="33"/>
       </w:tcPr>
     </w:tblStylePr>
-  </w:style>
-  <w:style w:type="paragraph" w:styleId="En-tte">
-    <w:name w:val="header"/>
-    <w:basedOn w:val="Normal"/>
-    <w:link w:val="En-tteCar"/>
-    <w:uiPriority w:val="99"/>
-    <w:unhideWhenUsed/>
-    <w:rsid w:val="0048109F"/>
-    <w:pPr>
-      <w:tabs>
-        <w:tab w:val="center" w:pos="4536"/>
-        <w:tab w:val="right" w:pos="9072"/>
-      </w:tabs>
-      <w:spacing w:after="0" w:line="240" w:lineRule="auto"/>
-    </w:pPr>
-  </w:style>
-  <w:style w:type="character" w:customStyle="1" w:styleId="En-tteCar">
-    <w:name w:val="En-tête Car"/>
-    <w:basedOn w:val="Policepardfaut"/>
-    <w:link w:val="En-tte"/>
-    <w:uiPriority w:val="99"/>
-    <w:rsid w:val="0048109F"/>
-    <w:rPr>
-      <w:rFonts w:ascii="Times New Roman" w:hAnsi="Times New Roman" w:cs="Times New Roman"/>
-      <w:color w:val="000000" w:themeColor="text1"/>
-      <w:sz w:val="20"/>
-      <w:szCs w:val="20"/>
-      <w:lang w:val="en-US"/>
-    </w:rPr>
-  </w:style>
-  <w:style w:type="paragraph" w:styleId="Pieddepage">
-    <w:name w:val="footer"/>
-    <w:basedOn w:val="Normal"/>
-    <w:link w:val="PieddepageCar"/>
-    <w:uiPriority w:val="99"/>
-    <w:unhideWhenUsed/>
-    <w:rsid w:val="0048109F"/>
-    <w:pPr>
-      <w:tabs>
-        <w:tab w:val="center" w:pos="4536"/>
-        <w:tab w:val="right" w:pos="9072"/>
-      </w:tabs>
-      <w:spacing w:after="0" w:line="240" w:lineRule="auto"/>
-    </w:pPr>
-  </w:style>
-  <w:style w:type="character" w:customStyle="1" w:styleId="PieddepageCar">
-    <w:name w:val="Pied de page Car"/>
-    <w:basedOn w:val="Policepardfaut"/>
-    <w:link w:val="Pieddepage"/>
-    <w:uiPriority w:val="99"/>
-    <w:rsid w:val="0048109F"/>
-    <w:rPr>
-      <w:rFonts w:ascii="Times New Roman" w:hAnsi="Times New Roman" w:cs="Times New Roman"/>
-      <w:color w:val="000000" w:themeColor="text1"/>
-      <w:sz w:val="20"/>
-      <w:szCs w:val="20"/>
-      <w:lang w:val="en-US"/>
-    </w:rPr>
-  </w:style>
-  <w:style w:type="paragraph" w:styleId="Notedebasdepage">
-    <w:name w:val="footnote text"/>
-    <w:basedOn w:val="Normal"/>
-    <w:link w:val="NotedebasdepageCar"/>
-    <w:uiPriority w:val="99"/>
-    <w:semiHidden/>
-    <w:unhideWhenUsed/>
-    <w:rsid w:val="00164BDE"/>
-    <w:pPr>
-      <w:spacing w:after="0" w:line="240" w:lineRule="auto"/>
-    </w:pPr>
-  </w:style>
-  <w:style w:type="character" w:customStyle="1" w:styleId="NotedebasdepageCar">
-    <w:name w:val="Note de bas de page Car"/>
-    <w:basedOn w:val="Policepardfaut"/>
-    <w:link w:val="Notedebasdepage"/>
-    <w:uiPriority w:val="99"/>
-    <w:semiHidden/>
-    <w:rsid w:val="00164BDE"/>
-    <w:rPr>
-      <w:rFonts w:ascii="Times New Roman" w:hAnsi="Times New Roman" w:cs="Times New Roman"/>
-      <w:color w:val="000000" w:themeColor="text1"/>
-      <w:sz w:val="20"/>
-      <w:szCs w:val="20"/>
-      <w:lang w:val="en-US"/>
-    </w:rPr>
-  </w:style>
-  <w:style w:type="character" w:styleId="Appelnotedebasdep">
-    <w:name w:val="footnote reference"/>
-    <w:basedOn w:val="Policepardfaut"/>
-    <w:uiPriority w:val="99"/>
-    <w:semiHidden/>
-    <w:unhideWhenUsed/>
-    <w:rsid w:val="00164BDE"/>
-    <w:rPr>
-      <w:vertAlign w:val="superscript"/>
-    </w:rPr>
   </w:style>
 </w:styles>
 </file>

</xml_diff>